<commit_message>
Module giao bài và chấm bài: ngân hàng đề — thêm, gắn thẻ, nạp đề vào bài tập
</commit_message>
<xml_diff>
--- a/docx/02-use-case.docx
+++ b/docx/02-use-case.docx
@@ -28,7 +28,7 @@
         </w:p>
       </w:sdtContent>
     </w:sdt>
-    <w:bookmarkStart w:id="50" w:name="Xf405151645ed4d95321dc1da34fff25e1e5d822"/>
+    <w:bookmarkStart w:id="51" w:name="Xf405151645ed4d95321dc1da34fff25e1e5d822"/>
     <w:p>
       <w:pPr>
         <w:pStyle w:val="Heading1"/>
@@ -2414,7 +2414,7 @@
               <a:graphicData uri="http://schemas.openxmlformats.org/drawingml/2006/picture">
                 <pic:pic>
                   <pic:nvPicPr>
-                    <pic:cNvPr descr="D:/LTMTU/docx/hinh/02-use-case-hinh-1.png" id="13" name="Picture"/>
+                    <pic:cNvPr descr="D:/Desktop/Ielts-system/docx/hinh/02-use-case-hinh-1.png" id="13" name="Picture"/>
                     <pic:cNvPicPr>
                       <a:picLocks noChangeArrowheads="1" noChangeAspect="1"/>
                     </pic:cNvPicPr>
@@ -2471,7 +2471,7 @@
               <a:graphicData uri="http://schemas.openxmlformats.org/drawingml/2006/picture">
                 <pic:pic>
                   <pic:nvPicPr>
-                    <pic:cNvPr descr="D:/LTMTU/docx/hinh/02-use-case-hinh-2.png" id="17" name="Picture"/>
+                    <pic:cNvPr descr="D:/Desktop/Ielts-system/docx/hinh/02-use-case-hinh-2.png" id="17" name="Picture"/>
                     <pic:cNvPicPr>
                       <a:picLocks noChangeArrowheads="1" noChangeAspect="1"/>
                     </pic:cNvPicPr>
@@ -2528,7 +2528,7 @@
               <a:graphicData uri="http://schemas.openxmlformats.org/drawingml/2006/picture">
                 <pic:pic>
                   <pic:nvPicPr>
-                    <pic:cNvPr descr="D:/LTMTU/docx/hinh/02-use-case-hinh-3.png" id="21" name="Picture"/>
+                    <pic:cNvPr descr="D:/Desktop/Ielts-system/docx/hinh/02-use-case-hinh-3.png" id="21" name="Picture"/>
                     <pic:cNvPicPr>
                       <a:picLocks noChangeArrowheads="1" noChangeAspect="1"/>
                     </pic:cNvPicPr>
@@ -2585,7 +2585,7 @@
               <a:graphicData uri="http://schemas.openxmlformats.org/drawingml/2006/picture">
                 <pic:pic>
                   <pic:nvPicPr>
-                    <pic:cNvPr descr="D:/LTMTU/docx/hinh/02-use-case-hinh-4.png" id="25" name="Picture"/>
+                    <pic:cNvPr descr="D:/Desktop/Ielts-system/docx/hinh/02-use-case-hinh-4.png" id="25" name="Picture"/>
                     <pic:cNvPicPr>
                       <a:picLocks noChangeArrowheads="1" noChangeAspect="1"/>
                     </pic:cNvPicPr>
@@ -2642,7 +2642,7 @@
               <a:graphicData uri="http://schemas.openxmlformats.org/drawingml/2006/picture">
                 <pic:pic>
                   <pic:nvPicPr>
-                    <pic:cNvPr descr="D:/LTMTU/docx/hinh/02-use-case-hinh-5.png" id="29" name="Picture"/>
+                    <pic:cNvPr descr="D:/Desktop/Ielts-system/docx/hinh/02-use-case-hinh-5.png" id="29" name="Picture"/>
                     <pic:cNvPicPr>
                       <a:picLocks noChangeArrowheads="1" noChangeAspect="1"/>
                     </pic:cNvPicPr>
@@ -2684,7 +2684,7 @@
     </w:p>
     <w:bookmarkEnd w:id="30"/>
     <w:bookmarkEnd w:id="31"/>
-    <w:bookmarkStart w:id="48" w:name="X4b2acd8ba5b81cf87dbf9b891a76d291d4a79c2"/>
+    <w:bookmarkStart w:id="49" w:name="X4b2acd8ba5b81cf87dbf9b891a76d291d4a79c2"/>
     <w:p>
       <w:pPr>
         <w:pStyle w:val="Heading2"/>
@@ -6353,13 +6353,13 @@
       </w:r>
     </w:p>
     <w:bookmarkEnd w:id="40"/>
-    <w:bookmarkStart w:id="41" w:name="uc-23--làm-bài-và-lưu-nháp"/>
+    <w:bookmarkStart w:id="41" w:name="uc-20--quản-lý-ngân-hàng-đề"/>
     <w:p>
       <w:pPr>
         <w:pStyle w:val="Heading3"/>
       </w:pPr>
       <w:r>
-        <w:t xml:space="preserve">UC-23 · Làm bài và lưu nháp</w:t>
+        <w:t xml:space="preserve">UC-20 · Quản lý ngân hàng đề</w:t>
       </w:r>
     </w:p>
     <w:tbl>
@@ -6418,7 +6418,7 @@
               <w:pStyle w:val="Compact"/>
             </w:pPr>
             <w:r>
-              <w:t xml:space="preserve">Sinh viên</w:t>
+              <w:t xml:space="preserve">Giáo viên</w:t>
             </w:r>
           </w:p>
         </w:tc>
@@ -6442,7 +6442,7 @@
               <w:pStyle w:val="Compact"/>
             </w:pPr>
             <w:r>
-              <w:t xml:space="preserve">Soạn bài cho từng phần. Hệ thống tự lưu nháp để không mất nội dung.</w:t>
+              <w:t xml:space="preserve">Lưu đề kèm rubric/checklist và tag để tìm, sửa, xoá và dùng lại khi soạn bài tập.</w:t>
             </w:r>
           </w:p>
         </w:tc>
@@ -6466,7 +6466,7 @@
               <w:pStyle w:val="Compact"/>
             </w:pPr>
             <w:r>
-              <w:t xml:space="preserve">Bài đã phát hành, đã tới thời điểm mở, sinh viên được giao bài (BR-04, BR-05). Phần đó chưa nộp, hoặc đang ở trạng thái Yêu cầu sửa.</w:t>
+              <w:t xml:space="preserve">Giáo viên đã đăng nhập.</w:t>
             </w:r>
           </w:p>
         </w:tc>
@@ -6490,7 +6490,7 @@
               <w:pStyle w:val="Compact"/>
             </w:pPr>
             <w:r>
-              <w:t xml:space="preserve">Bản nháp mới nhất được lưu trên server.</w:t>
+              <w:t xml:space="preserve">Đề và rubric riêng được lưu trong ngân hàng của đúng giáo viên.</w:t>
             </w:r>
           </w:p>
         </w:tc>
@@ -6517,7 +6517,7 @@
         </w:numPr>
       </w:pPr>
       <w:r>
-        <w:t xml:space="preserve">Sinh viên mở bài và chọn một phần. Mỗi phần là một tab.</w:t>
+        <w:t xml:space="preserve">Giáo viên mở Ngân hàng đề, tìm kiếm theo tên/nội dung hoặc lọc theo loại Task và tag.</w:t>
       </w:r>
     </w:p>
     <w:p>
@@ -6529,84 +6529,55 @@
         </w:numPr>
       </w:pPr>
       <w:r>
-        <w:t xml:space="preserve">Hệ thống hiển thị đề bài, ảnh biểu đồ, số từ tối thiểu, thời gian gợi ý và</w:t>
-      </w:r>
-      <w:r>
-        <w:t xml:space="preserve"> </w:t>
-      </w:r>
+        <w:t xml:space="preserve">Giáo viên tạo đề, nhập loại Task, nội dung, ảnh, số từ, thời gian gợi ý, tag và rubric/checklist.</w:t>
+      </w:r>
+    </w:p>
+    <w:p>
+      <w:pPr>
+        <w:pStyle w:val="Compact"/>
+        <w:numPr>
+          <w:ilvl w:val="0"/>
+          <w:numId w:val="1029"/>
+        </w:numPr>
+      </w:pPr>
+      <w:r>
+        <w:t xml:space="preserve">Hệ thống lọc HTML, kiểm tra rubric rồi lưu đề cùng một rubric mẫu riêng của giáo viên.</w:t>
+      </w:r>
+    </w:p>
+    <w:p>
+      <w:pPr>
+        <w:pStyle w:val="Compact"/>
+        <w:numPr>
+          <w:ilvl w:val="0"/>
+          <w:numId w:val="1029"/>
+        </w:numPr>
+      </w:pPr>
+      <w:r>
+        <w:t xml:space="preserve">Giáo viên xem, thay toàn bộ hoặc xoá đề của mình.</w:t>
+      </w:r>
+    </w:p>
+    <w:p>
+      <w:pPr>
+        <w:pStyle w:val="Compact"/>
+        <w:numPr>
+          <w:ilvl w:val="0"/>
+          <w:numId w:val="1029"/>
+        </w:numPr>
+      </w:pPr>
+      <w:r>
+        <w:t xml:space="preserve">Khi soạn bài tập, giáo viên chọn một đề trong ngân hàng; hệ thống sao chép đề và rubric sang phần bài tập, thay đổi về sau không ảnh hưởng bản đã sao chép.</w:t>
+      </w:r>
+    </w:p>
+    <w:p>
+      <w:pPr>
+        <w:pStyle w:val="FirstParagraph"/>
+      </w:pPr>
       <w:r>
         <w:rPr>
           <w:b/>
           <w:bCs/>
         </w:rPr>
-        <w:t xml:space="preserve">đồng hồ đếm ngược tới hạn nộp</w:t>
-      </w:r>
-      <w:r>
-        <w:t xml:space="preserve"> </w:t>
-      </w:r>
-      <w:r>
-        <w:t xml:space="preserve">theo giờ server (FR-56). Nếu đã có bản nháp thì nạp lại nội dung.</w:t>
-      </w:r>
-    </w:p>
-    <w:p>
-      <w:pPr>
-        <w:pStyle w:val="Compact"/>
-        <w:numPr>
-          <w:ilvl w:val="0"/>
-          <w:numId w:val="1029"/>
-        </w:numPr>
-      </w:pPr>
-      <w:r>
-        <w:t xml:space="preserve">Sinh viên gõ bài. Hệ thống đếm số từ ngay khi gõ và cảnh báo nếu chưa đủ số từ tối thiểu.</w:t>
-      </w:r>
-    </w:p>
-    <w:p>
-      <w:pPr>
-        <w:pStyle w:val="Compact"/>
-        <w:numPr>
-          <w:ilvl w:val="0"/>
-          <w:numId w:val="1029"/>
-        </w:numPr>
-      </w:pPr>
-      <w:r>
-        <w:t xml:space="preserve">Sau</w:t>
-      </w:r>
-      <w:r>
-        <w:t xml:space="preserve"> </w:t>
-      </w:r>
-      <w:r>
-        <w:rPr>
-          <w:b/>
-          <w:bCs/>
-        </w:rPr>
-        <w:t xml:space="preserve">3 giây ngừng gõ</w:t>
-      </w:r>
-      <w:r>
-        <w:t xml:space="preserve">, và khi chuyển tab hoặc rời trang, hệ thống lưu nháp lên server rồi hiển thị "Đã lưu lúc hh:mm".</w:t>
-      </w:r>
-    </w:p>
-    <w:p>
-      <w:pPr>
-        <w:pStyle w:val="Compact"/>
-        <w:numPr>
-          <w:ilvl w:val="0"/>
-          <w:numId w:val="1029"/>
-        </w:numPr>
-      </w:pPr>
-      <w:r>
-        <w:t xml:space="preserve">Sinh viên chuyển sang UC-24 để nộp, hoặc rời trang và quay lại sau.</w:t>
-      </w:r>
-    </w:p>
-    <w:p>
-      <w:pPr>
-        <w:pStyle w:val="FirstParagraph"/>
-      </w:pPr>
-      <w:r>
-        <w:rPr>
-          <w:b/>
-          <w:bCs/>
-        </w:rPr>
-        <w:t xml:space="preserve">Luồng thay thế</w:t>
+        <w:t xml:space="preserve">Ngoại lệ</w:t>
       </w:r>
     </w:p>
     <w:p>
@@ -6618,30 +6589,34 @@
         </w:numPr>
       </w:pPr>
       <w:r>
-        <w:t xml:space="preserve">A1.</w:t>
-      </w:r>
-      <w:r>
-        <w:t xml:space="preserve"> </w:t>
-      </w:r>
-      <w:r>
-        <w:rPr>
-          <w:i/>
-          <w:iCs/>
-        </w:rPr>
-        <w:t xml:space="preserve">(Mức 2)</w:t>
-      </w:r>
-      <w:r>
-        <w:t xml:space="preserve"> </w:t>
-      </w:r>
-      <w:r>
-        <w:rPr>
-          <w:b/>
-          <w:bCs/>
-        </w:rPr>
-        <w:t xml:space="preserve">Mất mạng</w:t>
-      </w:r>
-      <w:r>
-        <w:t xml:space="preserve">: nháp vẫn được lưu vào bộ nhớ trình duyệt (IndexedDB), giao diện hiện "Đang ngoại tuyến – đã lưu trên máy". Khi có mạng lại, hệ thống tự đồng bộ lên server (FR-36, NFR-05).</w:t>
+        <w:t xml:space="preserve">E1. Ảnh không thuộc</w:t>
+      </w:r>
+      <w:r>
+        <w:t xml:space="preserve"> </w:t>
+      </w:r>
+      <w:r>
+        <w:rPr>
+          <w:rStyle w:val="VerbatimChar"/>
+        </w:rPr>
+        <w:t xml:space="preserve">/uploads/</w:t>
+      </w:r>
+      <w:r>
+        <w:t xml:space="preserve"> </w:t>
+      </w:r>
+      <w:r>
+        <w:t xml:space="preserve">hoặc URL HTTP(S), rubric sai bước điểm/giới hạn →</w:t>
+      </w:r>
+      <w:r>
+        <w:t xml:space="preserve"> </w:t>
+      </w:r>
+      <w:r>
+        <w:rPr>
+          <w:rStyle w:val="VerbatimChar"/>
+        </w:rPr>
+        <w:t xml:space="preserve">400 VALIDATION_ERROR</w:t>
+      </w:r>
+      <w:r>
+        <w:t xml:space="preserve">.</w:t>
       </w:r>
     </w:p>
     <w:p>
@@ -6653,66 +6628,43 @@
         </w:numPr>
       </w:pPr>
       <w:r>
-        <w:t xml:space="preserve">A2.</w:t>
-      </w:r>
-      <w:r>
-        <w:t xml:space="preserve"> </w:t>
-      </w:r>
-      <w:r>
-        <w:rPr>
-          <w:i/>
-          <w:iCs/>
-        </w:rPr>
-        <w:t xml:space="preserve">(Mức 2)</w:t>
-      </w:r>
-      <w:r>
-        <w:t xml:space="preserve"> </w:t>
-      </w:r>
-      <w:r>
-        <w:rPr>
-          <w:b/>
-          <w:bCs/>
-        </w:rPr>
-        <w:t xml:space="preserve">Xung đột</w:t>
-      </w:r>
-      <w:r>
-        <w:t xml:space="preserve">: sinh viên mở cùng phần ở 2 tab hoặc 2 máy, và bản trên server mới hơn bản đang sửa → hệ thống hiện hộp thoại cho sinh viên chọn giữ bản nào.</w:t>
-      </w:r>
-    </w:p>
-    <w:p>
-      <w:pPr>
-        <w:pStyle w:val="FirstParagraph"/>
-      </w:pPr>
-      <w:r>
-        <w:rPr>
-          <w:b/>
-          <w:bCs/>
-        </w:rPr>
-        <w:t xml:space="preserve">Ngoại lệ</w:t>
-      </w:r>
-    </w:p>
-    <w:p>
-      <w:pPr>
-        <w:pStyle w:val="Compact"/>
-        <w:numPr>
-          <w:ilvl w:val="0"/>
-          <w:numId w:val="1031"/>
-        </w:numPr>
-      </w:pPr>
-      <w:r>
-        <w:t xml:space="preserve">E1. Đã quá hạn và bài không cho nộp muộn → chỉ xem, không soạn được.</w:t>
-      </w:r>
-    </w:p>
-    <w:p>
-      <w:pPr>
-        <w:pStyle w:val="Compact"/>
-        <w:numPr>
-          <w:ilvl w:val="0"/>
-          <w:numId w:val="1031"/>
-        </w:numPr>
-      </w:pPr>
-      <w:r>
-        <w:t xml:space="preserve">E2. Bài đã bị giáo viên đóng → chỉ xem.</w:t>
+        <w:t xml:space="preserve">E2. Đề thuộc giáo viên khác hoặc không tồn tại →</w:t>
+      </w:r>
+      <w:r>
+        <w:t xml:space="preserve"> </w:t>
+      </w:r>
+      <w:r>
+        <w:rPr>
+          <w:rStyle w:val="VerbatimChar"/>
+        </w:rPr>
+        <w:t xml:space="preserve">404 NOT_FOUND</w:t>
+      </w:r>
+      <w:r>
+        <w:t xml:space="preserve">.</w:t>
+      </w:r>
+    </w:p>
+    <w:p>
+      <w:pPr>
+        <w:pStyle w:val="Compact"/>
+        <w:numPr>
+          <w:ilvl w:val="0"/>
+          <w:numId w:val="1030"/>
+        </w:numPr>
+      </w:pPr>
+      <w:r>
+        <w:t xml:space="preserve">E3. Nội dung rỗng sau khi lọc HTML →</w:t>
+      </w:r>
+      <w:r>
+        <w:t xml:space="preserve"> </w:t>
+      </w:r>
+      <w:r>
+        <w:rPr>
+          <w:rStyle w:val="VerbatimChar"/>
+        </w:rPr>
+        <w:t xml:space="preserve">400 VALIDATION_ERROR</w:t>
+      </w:r>
+      <w:r>
+        <w:t xml:space="preserve">.</w:t>
       </w:r>
     </w:p>
     <w:p>
@@ -6723,13 +6675,13 @@
       </w:r>
     </w:p>
     <w:bookmarkEnd w:id="41"/>
-    <w:bookmarkStart w:id="42" w:name="uc-24--nộp-bài-từng-phần"/>
+    <w:bookmarkStart w:id="42" w:name="uc-23--làm-bài-và-lưu-nháp"/>
     <w:p>
       <w:pPr>
         <w:pStyle w:val="Heading3"/>
       </w:pPr>
       <w:r>
-        <w:t xml:space="preserve">UC-24 · Nộp bài từng phần</w:t>
+        <w:t xml:space="preserve">UC-23 · Làm bài và lưu nháp</w:t>
       </w:r>
     </w:p>
     <w:tbl>
@@ -6788,7 +6740,7 @@
               <w:pStyle w:val="Compact"/>
             </w:pPr>
             <w:r>
-              <w:t xml:space="preserve">Sinh viên. Tác nhân phụ: Giáo viên (nhận thông báo).</w:t>
+              <w:t xml:space="preserve">Sinh viên</w:t>
             </w:r>
           </w:p>
         </w:tc>
@@ -6812,20 +6764,7 @@
               <w:pStyle w:val="Compact"/>
             </w:pPr>
             <w:r>
-              <w:t xml:space="preserve">Nộp nội dung của</w:t>
-            </w:r>
-            <w:r>
-              <w:t xml:space="preserve"> </w:t>
-            </w:r>
-            <w:r>
-              <w:rPr>
-                <w:b/>
-                <w:bCs/>
-              </w:rPr>
-              <w:t xml:space="preserve">một phần</w:t>
-            </w:r>
-            <w:r>
-              <w:t xml:space="preserve">. Mỗi phần nộp độc lập (BR-09).</w:t>
+              <w:t xml:space="preserve">Soạn bài cho từng phần. Hệ thống tự lưu nháp để không mất nội dung.</w:t>
             </w:r>
           </w:p>
         </w:tc>
@@ -6849,7 +6788,7 @@
               <w:pStyle w:val="Compact"/>
             </w:pPr>
             <w:r>
-              <w:t xml:space="preserve">Như UC-23. Nội dung không rỗng.</w:t>
+              <w:t xml:space="preserve">Bài đã phát hành, đã tới thời điểm mở, sinh viên được giao bài (BR-04, BR-05). Phần đó chưa nộp, hoặc đang ở trạng thái Yêu cầu sửa.</w:t>
             </w:r>
           </w:p>
         </w:tc>
@@ -6873,20 +6812,7 @@
               <w:pStyle w:val="Compact"/>
             </w:pPr>
             <w:r>
-              <w:t xml:space="preserve">Có một version mới bất biến (NFR-11). Bài nộp chuyển sang</w:t>
-            </w:r>
-            <w:r>
-              <w:t xml:space="preserve"> </w:t>
-            </w:r>
-            <w:r>
-              <w:rPr>
-                <w:b/>
-                <w:bCs/>
-              </w:rPr>
-              <w:t xml:space="preserve">Đã nộp</w:t>
-            </w:r>
-            <w:r>
-              <w:t xml:space="preserve">. Giáo viên nhận thông báo.</w:t>
+              <w:t xml:space="preserve">Bản nháp mới nhất được lưu trên server.</w:t>
             </w:r>
           </w:p>
         </w:tc>
@@ -6909,35 +6835,23 @@
         <w:pStyle w:val="Compact"/>
         <w:numPr>
           <w:ilvl w:val="0"/>
-          <w:numId w:val="1032"/>
-        </w:numPr>
-      </w:pPr>
-      <w:r>
-        <w:t xml:space="preserve">Sinh viên bấm "Nộp phần này".</w:t>
-      </w:r>
-    </w:p>
-    <w:p>
-      <w:pPr>
-        <w:pStyle w:val="Compact"/>
-        <w:numPr>
-          <w:ilvl w:val="0"/>
-          <w:numId w:val="1032"/>
-        </w:numPr>
-      </w:pPr>
-      <w:r>
-        <w:t xml:space="preserve">Nếu chưa đủ số từ tối thiểu, hệ thống hỏi lại để xác nhận.</w:t>
-      </w:r>
-    </w:p>
-    <w:p>
-      <w:pPr>
-        <w:pStyle w:val="Compact"/>
-        <w:numPr>
-          <w:ilvl w:val="0"/>
-          <w:numId w:val="1032"/>
-        </w:numPr>
-      </w:pPr>
-      <w:r>
-        <w:t xml:space="preserve">Hệ thống xác định hạn áp dụng (BR-07) và so với</w:t>
+          <w:numId w:val="1031"/>
+        </w:numPr>
+      </w:pPr>
+      <w:r>
+        <w:t xml:space="preserve">Sinh viên mở bài và chọn một phần. Mỗi phần là một tab.</w:t>
+      </w:r>
+    </w:p>
+    <w:p>
+      <w:pPr>
+        <w:pStyle w:val="Compact"/>
+        <w:numPr>
+          <w:ilvl w:val="0"/>
+          <w:numId w:val="1031"/>
+        </w:numPr>
+      </w:pPr>
+      <w:r>
+        <w:t xml:space="preserve">Hệ thống hiển thị đề bài, ảnh biểu đồ, số từ tối thiểu, thời gian gợi ý và</w:t>
       </w:r>
       <w:r>
         <w:t xml:space="preserve"> </w:t>
@@ -6947,13 +6861,74 @@
           <w:b/>
           <w:bCs/>
         </w:rPr>
-        <w:t xml:space="preserve">giờ server</w:t>
-      </w:r>
-      <w:r>
-        <w:t xml:space="preserve"> </w:t>
-      </w:r>
-      <w:r>
-        <w:t xml:space="preserve">(NFR-12).</w:t>
+        <w:t xml:space="preserve">đồng hồ đếm ngược tới hạn nộp</w:t>
+      </w:r>
+      <w:r>
+        <w:t xml:space="preserve"> </w:t>
+      </w:r>
+      <w:r>
+        <w:t xml:space="preserve">theo giờ server (FR-56). Nếu đã có bản nháp thì nạp lại nội dung.</w:t>
+      </w:r>
+    </w:p>
+    <w:p>
+      <w:pPr>
+        <w:pStyle w:val="Compact"/>
+        <w:numPr>
+          <w:ilvl w:val="0"/>
+          <w:numId w:val="1031"/>
+        </w:numPr>
+      </w:pPr>
+      <w:r>
+        <w:t xml:space="preserve">Sinh viên gõ bài. Hệ thống đếm số từ ngay khi gõ và cảnh báo nếu chưa đủ số từ tối thiểu.</w:t>
+      </w:r>
+    </w:p>
+    <w:p>
+      <w:pPr>
+        <w:pStyle w:val="Compact"/>
+        <w:numPr>
+          <w:ilvl w:val="0"/>
+          <w:numId w:val="1031"/>
+        </w:numPr>
+      </w:pPr>
+      <w:r>
+        <w:t xml:space="preserve">Sau</w:t>
+      </w:r>
+      <w:r>
+        <w:t xml:space="preserve"> </w:t>
+      </w:r>
+      <w:r>
+        <w:rPr>
+          <w:b/>
+          <w:bCs/>
+        </w:rPr>
+        <w:t xml:space="preserve">3 giây ngừng gõ</w:t>
+      </w:r>
+      <w:r>
+        <w:t xml:space="preserve">, và khi chuyển tab hoặc rời trang, hệ thống lưu nháp lên server rồi hiển thị "Đã lưu lúc hh:mm".</w:t>
+      </w:r>
+    </w:p>
+    <w:p>
+      <w:pPr>
+        <w:pStyle w:val="Compact"/>
+        <w:numPr>
+          <w:ilvl w:val="0"/>
+          <w:numId w:val="1031"/>
+        </w:numPr>
+      </w:pPr>
+      <w:r>
+        <w:t xml:space="preserve">Sinh viên chuyển sang UC-24 để nộp, hoặc rời trang và quay lại sau.</w:t>
+      </w:r>
+    </w:p>
+    <w:p>
+      <w:pPr>
+        <w:pStyle w:val="FirstParagraph"/>
+      </w:pPr>
+      <w:r>
+        <w:rPr>
+          <w:b/>
+          <w:bCs/>
+        </w:rPr>
+        <w:t xml:space="preserve">Luồng thay thế</w:t>
       </w:r>
     </w:p>
     <w:p>
@@ -6965,31 +6940,7 @@
         </w:numPr>
       </w:pPr>
       <w:r>
-        <w:t xml:space="preserve">Hệ thống tạo version mới với số thứ tự tăng dần, lưu nội dung, số từ, thời điểm nộp và cờ "muộn".</w:t>
-      </w:r>
-    </w:p>
-    <w:p>
-      <w:pPr>
-        <w:pStyle w:val="Compact"/>
-        <w:numPr>
-          <w:ilvl w:val="0"/>
-          <w:numId w:val="1032"/>
-        </w:numPr>
-      </w:pPr>
-      <w:r>
-        <w:t xml:space="preserve">Hệ thống xoá bản nháp và chuyển trạng thái bài nộp sang Đã nộp.</w:t>
-      </w:r>
-    </w:p>
-    <w:p>
-      <w:pPr>
-        <w:pStyle w:val="Compact"/>
-        <w:numPr>
-          <w:ilvl w:val="0"/>
-          <w:numId w:val="1032"/>
-        </w:numPr>
-      </w:pPr>
-      <w:r>
-        <w:t xml:space="preserve">Hệ thống thông báo cho giáo viên, và</w:t>
+        <w:t xml:space="preserve">A1.</w:t>
       </w:r>
       <w:r>
         <w:t xml:space="preserve"> </w:t>
@@ -7005,43 +6956,36 @@
         <w:t xml:space="preserve"> </w:t>
       </w:r>
       <w:r>
-        <w:t xml:space="preserve">cập nhật ma trận tiến độ live.</w:t>
-      </w:r>
-    </w:p>
-    <w:p>
-      <w:pPr>
-        <w:pStyle w:val="Compact"/>
-        <w:numPr>
-          <w:ilvl w:val="0"/>
-          <w:numId w:val="1032"/>
-        </w:numPr>
-      </w:pPr>
-      <w:r>
-        <w:t xml:space="preserve">Sinh viên thấy xác nhận "Đã nộp lúc hh:mm".</w:t>
-      </w:r>
-    </w:p>
-    <w:p>
-      <w:pPr>
-        <w:pStyle w:val="FirstParagraph"/>
-      </w:pPr>
-      <w:r>
         <w:rPr>
           <w:b/>
           <w:bCs/>
         </w:rPr>
-        <w:t xml:space="preserve">Luồng thay thế</w:t>
-      </w:r>
-    </w:p>
-    <w:p>
-      <w:pPr>
-        <w:pStyle w:val="Compact"/>
-        <w:numPr>
-          <w:ilvl w:val="0"/>
-          <w:numId w:val="1033"/>
-        </w:numPr>
-      </w:pPr>
-      <w:r>
-        <w:t xml:space="preserve">A1. Nộp sau hạn và bài</w:t>
+        <w:t xml:space="preserve">Mất mạng</w:t>
+      </w:r>
+      <w:r>
+        <w:t xml:space="preserve">: nháp vẫn được lưu vào bộ nhớ trình duyệt (IndexedDB), giao diện hiện "Đang ngoại tuyến – đã lưu trên máy". Khi có mạng lại, hệ thống tự đồng bộ lên server (FR-36, NFR-05).</w:t>
+      </w:r>
+    </w:p>
+    <w:p>
+      <w:pPr>
+        <w:pStyle w:val="Compact"/>
+        <w:numPr>
+          <w:ilvl w:val="0"/>
+          <w:numId w:val="1032"/>
+        </w:numPr>
+      </w:pPr>
+      <w:r>
+        <w:t xml:space="preserve">A2.</w:t>
+      </w:r>
+      <w:r>
+        <w:t xml:space="preserve"> </w:t>
+      </w:r>
+      <w:r>
+        <w:rPr>
+          <w:i/>
+          <w:iCs/>
+        </w:rPr>
+        <w:t xml:space="preserve">(Mức 2)</w:t>
       </w:r>
       <w:r>
         <w:t xml:space="preserve"> </w:t>
@@ -7051,13 +6995,10 @@
           <w:b/>
           <w:bCs/>
         </w:rPr>
-        <w:t xml:space="preserve">cho phép nộp muộn</w:t>
-      </w:r>
-      <w:r>
-        <w:t xml:space="preserve"> </w:t>
-      </w:r>
-      <w:r>
-        <w:t xml:space="preserve">→ vẫn nhận, đánh dấu "muộn" (BR-08).</w:t>
+        <w:t xml:space="preserve">Xung đột</w:t>
+      </w:r>
+      <w:r>
+        <w:t xml:space="preserve">: sinh viên mở cùng phần ở 2 tab hoặc 2 máy, và bản trên server mới hơn bản đang sửa → hệ thống hiện hộp thoại cho sinh viên chọn giữ bản nào.</w:t>
       </w:r>
     </w:p>
     <w:p>
@@ -7077,51 +7018,23 @@
         <w:pStyle w:val="Compact"/>
         <w:numPr>
           <w:ilvl w:val="0"/>
-          <w:numId w:val="1034"/>
-        </w:numPr>
-      </w:pPr>
-      <w:r>
-        <w:t xml:space="preserve">E1. Nộp sau hạn và bài</w:t>
-      </w:r>
-      <w:r>
-        <w:t xml:space="preserve"> </w:t>
-      </w:r>
-      <w:r>
-        <w:rPr>
-          <w:b/>
-          <w:bCs/>
-        </w:rPr>
-        <w:t xml:space="preserve">không cho nộp muộn</w:t>
-      </w:r>
-      <w:r>
-        <w:t xml:space="preserve"> </w:t>
-      </w:r>
-      <w:r>
-        <w:t xml:space="preserve">→ từ chối, báo "Đã quá hạn nộp" (BR-08).</w:t>
-      </w:r>
-    </w:p>
-    <w:p>
-      <w:pPr>
-        <w:pStyle w:val="Compact"/>
-        <w:numPr>
-          <w:ilvl w:val="0"/>
-          <w:numId w:val="1034"/>
-        </w:numPr>
-      </w:pPr>
-      <w:r>
-        <w:t xml:space="preserve">E2. Phần đã nộp và không ở trạng thái Yêu cầu sửa → từ chối nộp lại.</w:t>
-      </w:r>
-    </w:p>
-    <w:p>
-      <w:pPr>
-        <w:pStyle w:val="Compact"/>
-        <w:numPr>
-          <w:ilvl w:val="0"/>
-          <w:numId w:val="1034"/>
-        </w:numPr>
-      </w:pPr>
-      <w:r>
-        <w:t xml:space="preserve">E3. Mất mạng khi đang nộp → client báo lỗi và giữ nguyên nội dung. Sinh viên nộp lại khi có mạng. Server chống tạo trùng version cho cùng một lần bấm.</w:t>
+          <w:numId w:val="1033"/>
+        </w:numPr>
+      </w:pPr>
+      <w:r>
+        <w:t xml:space="preserve">E1. Đã quá hạn và bài không cho nộp muộn → chỉ xem, không soạn được.</w:t>
+      </w:r>
+    </w:p>
+    <w:p>
+      <w:pPr>
+        <w:pStyle w:val="Compact"/>
+        <w:numPr>
+          <w:ilvl w:val="0"/>
+          <w:numId w:val="1033"/>
+        </w:numPr>
+      </w:pPr>
+      <w:r>
+        <w:t xml:space="preserve">E2. Bài đã bị giáo viên đóng → chỉ xem.</w:t>
       </w:r>
     </w:p>
     <w:p>
@@ -7132,13 +7045,13 @@
       </w:r>
     </w:p>
     <w:bookmarkEnd w:id="42"/>
-    <w:bookmarkStart w:id="43" w:name="uc-26--sửa-bài-và-nộp-lại"/>
+    <w:bookmarkStart w:id="43" w:name="uc-24--nộp-bài-từng-phần"/>
     <w:p>
       <w:pPr>
         <w:pStyle w:val="Heading3"/>
       </w:pPr>
       <w:r>
-        <w:t xml:space="preserve">UC-26 · Sửa bài và nộp lại</w:t>
+        <w:t xml:space="preserve">UC-24 · Nộp bài từng phần</w:t>
       </w:r>
     </w:p>
     <w:tbl>
@@ -7197,7 +7110,7 @@
               <w:pStyle w:val="Compact"/>
             </w:pPr>
             <w:r>
-              <w:t xml:space="preserve">Sinh viên</w:t>
+              <w:t xml:space="preserve">Sinh viên. Tác nhân phụ: Giáo viên (nhận thông báo).</w:t>
             </w:r>
           </w:p>
         </w:tc>
@@ -7221,31 +7134,7 @@
               <w:pStyle w:val="Compact"/>
             </w:pPr>
             <w:r>
-              <w:t xml:space="preserve">Viết lại theo nhận xét của giáo viên và nộp version mới.</w:t>
-            </w:r>
-          </w:p>
-        </w:tc>
-      </w:tr>
-      <w:tr>
-        <w:tc>
-          <w:tcPr/>
-          <w:p>
-            <w:pPr>
-              <w:pStyle w:val="Compact"/>
-            </w:pPr>
-            <w:r>
-              <w:t xml:space="preserve">Tiền điều kiện</w:t>
-            </w:r>
-          </w:p>
-        </w:tc>
-        <w:tc>
-          <w:tcPr/>
-          <w:p>
-            <w:pPr>
-              <w:pStyle w:val="Compact"/>
-            </w:pPr>
-            <w:r>
-              <w:t xml:space="preserve">Bài nộp đang ở trạng thái</w:t>
+              <w:t xml:space="preserve">Nộp nội dung của</w:t>
             </w:r>
             <w:r>
               <w:t xml:space="preserve"> </w:t>
@@ -7255,10 +7144,34 @@
                 <w:b/>
                 <w:bCs/>
               </w:rPr>
-              <w:t xml:space="preserve">Yêu cầu sửa</w:t>
-            </w:r>
-            <w:r>
-              <w:t xml:space="preserve">, chưa vượt số lần sửa tối đa (BR-10).</w:t>
+              <w:t xml:space="preserve">một phần</w:t>
+            </w:r>
+            <w:r>
+              <w:t xml:space="preserve">. Mỗi phần nộp độc lập (BR-09).</w:t>
+            </w:r>
+          </w:p>
+        </w:tc>
+      </w:tr>
+      <w:tr>
+        <w:tc>
+          <w:tcPr/>
+          <w:p>
+            <w:pPr>
+              <w:pStyle w:val="Compact"/>
+            </w:pPr>
+            <w:r>
+              <w:t xml:space="preserve">Tiền điều kiện</w:t>
+            </w:r>
+          </w:p>
+        </w:tc>
+        <w:tc>
+          <w:tcPr/>
+          <w:p>
+            <w:pPr>
+              <w:pStyle w:val="Compact"/>
+            </w:pPr>
+            <w:r>
+              <w:t xml:space="preserve">Như UC-23. Nội dung không rỗng.</w:t>
             </w:r>
           </w:p>
         </w:tc>
@@ -7282,7 +7195,20 @@
               <w:pStyle w:val="Compact"/>
             </w:pPr>
             <w:r>
-              <w:t xml:space="preserve">Có version mới. Bài nộp quay lại trạng thái Đã nộp.</w:t>
+              <w:t xml:space="preserve">Có một version mới bất biến (NFR-11). Bài nộp chuyển sang</w:t>
+            </w:r>
+            <w:r>
+              <w:t xml:space="preserve"> </w:t>
+            </w:r>
+            <w:r>
+              <w:rPr>
+                <w:b/>
+                <w:bCs/>
+              </w:rPr>
+              <w:t xml:space="preserve">Đã nộp</w:t>
+            </w:r>
+            <w:r>
+              <w:t xml:space="preserve">. Giáo viên nhận thông báo.</w:t>
             </w:r>
           </w:p>
         </w:tc>
@@ -7305,47 +7231,35 @@
         <w:pStyle w:val="Compact"/>
         <w:numPr>
           <w:ilvl w:val="0"/>
-          <w:numId w:val="1035"/>
-        </w:numPr>
-      </w:pPr>
-      <w:r>
-        <w:t xml:space="preserve">Sinh viên mở bài có nhãn "Cần sửa" và đọc lời nhắn, hạn sửa, nhận xét của giáo viên.</w:t>
-      </w:r>
-    </w:p>
-    <w:p>
-      <w:pPr>
-        <w:pStyle w:val="Compact"/>
-        <w:numPr>
-          <w:ilvl w:val="0"/>
-          <w:numId w:val="1035"/>
-        </w:numPr>
-      </w:pPr>
-      <w:r>
-        <w:t xml:space="preserve">Hệ thống nạp nội dung version mới nhất vào ô soạn để sinh viên sửa tiếp.</w:t>
-      </w:r>
-    </w:p>
-    <w:p>
-      <w:pPr>
-        <w:pStyle w:val="Compact"/>
-        <w:numPr>
-          <w:ilvl w:val="0"/>
-          <w:numId w:val="1035"/>
-        </w:numPr>
-      </w:pPr>
-      <w:r>
-        <w:t xml:space="preserve">Sinh viên sửa bài. Hệ thống tự lưu nháp như UC-23.</w:t>
-      </w:r>
-    </w:p>
-    <w:p>
-      <w:pPr>
-        <w:pStyle w:val="Compact"/>
-        <w:numPr>
-          <w:ilvl w:val="0"/>
-          <w:numId w:val="1035"/>
-        </w:numPr>
-      </w:pPr>
-      <w:r>
-        <w:t xml:space="preserve">Sinh viên nộp như UC-24. Hạn áp dụng là</w:t>
+          <w:numId w:val="1034"/>
+        </w:numPr>
+      </w:pPr>
+      <w:r>
+        <w:t xml:space="preserve">Sinh viên bấm "Nộp phần này".</w:t>
+      </w:r>
+    </w:p>
+    <w:p>
+      <w:pPr>
+        <w:pStyle w:val="Compact"/>
+        <w:numPr>
+          <w:ilvl w:val="0"/>
+          <w:numId w:val="1034"/>
+        </w:numPr>
+      </w:pPr>
+      <w:r>
+        <w:t xml:space="preserve">Nếu chưa đủ số từ tối thiểu, hệ thống hỏi lại để xác nhận.</w:t>
+      </w:r>
+    </w:p>
+    <w:p>
+      <w:pPr>
+        <w:pStyle w:val="Compact"/>
+        <w:numPr>
+          <w:ilvl w:val="0"/>
+          <w:numId w:val="1034"/>
+        </w:numPr>
+      </w:pPr>
+      <w:r>
+        <w:t xml:space="preserve">Hệ thống xác định hạn áp dụng (BR-07) và so với</w:t>
       </w:r>
       <w:r>
         <w:t xml:space="preserve"> </w:t>
@@ -7355,13 +7269,77 @@
           <w:b/>
           <w:bCs/>
         </w:rPr>
-        <w:t xml:space="preserve">hạn sửa</w:t>
-      </w:r>
-      <w:r>
-        <w:t xml:space="preserve"> </w:t>
-      </w:r>
-      <w:r>
-        <w:t xml:space="preserve">(BR-07).</w:t>
+        <w:t xml:space="preserve">giờ server</w:t>
+      </w:r>
+      <w:r>
+        <w:t xml:space="preserve"> </w:t>
+      </w:r>
+      <w:r>
+        <w:t xml:space="preserve">(NFR-12).</w:t>
+      </w:r>
+    </w:p>
+    <w:p>
+      <w:pPr>
+        <w:pStyle w:val="Compact"/>
+        <w:numPr>
+          <w:ilvl w:val="0"/>
+          <w:numId w:val="1034"/>
+        </w:numPr>
+      </w:pPr>
+      <w:r>
+        <w:t xml:space="preserve">Hệ thống tạo version mới với số thứ tự tăng dần, lưu nội dung, số từ, thời điểm nộp và cờ "muộn".</w:t>
+      </w:r>
+    </w:p>
+    <w:p>
+      <w:pPr>
+        <w:pStyle w:val="Compact"/>
+        <w:numPr>
+          <w:ilvl w:val="0"/>
+          <w:numId w:val="1034"/>
+        </w:numPr>
+      </w:pPr>
+      <w:r>
+        <w:t xml:space="preserve">Hệ thống xoá bản nháp và chuyển trạng thái bài nộp sang Đã nộp.</w:t>
+      </w:r>
+    </w:p>
+    <w:p>
+      <w:pPr>
+        <w:pStyle w:val="Compact"/>
+        <w:numPr>
+          <w:ilvl w:val="0"/>
+          <w:numId w:val="1034"/>
+        </w:numPr>
+      </w:pPr>
+      <w:r>
+        <w:t xml:space="preserve">Hệ thống thông báo cho giáo viên, và</w:t>
+      </w:r>
+      <w:r>
+        <w:t xml:space="preserve"> </w:t>
+      </w:r>
+      <w:r>
+        <w:rPr>
+          <w:i/>
+          <w:iCs/>
+        </w:rPr>
+        <w:t xml:space="preserve">(Mức 2)</w:t>
+      </w:r>
+      <w:r>
+        <w:t xml:space="preserve"> </w:t>
+      </w:r>
+      <w:r>
+        <w:t xml:space="preserve">cập nhật ma trận tiến độ live.</w:t>
+      </w:r>
+    </w:p>
+    <w:p>
+      <w:pPr>
+        <w:pStyle w:val="Compact"/>
+        <w:numPr>
+          <w:ilvl w:val="0"/>
+          <w:numId w:val="1034"/>
+        </w:numPr>
+      </w:pPr>
+      <w:r>
+        <w:t xml:space="preserve">Sinh viên thấy xác nhận "Đã nộp lúc hh:mm".</w:t>
       </w:r>
     </w:p>
     <w:p>
@@ -7381,11 +7359,11 @@
         <w:pStyle w:val="Compact"/>
         <w:numPr>
           <w:ilvl w:val="0"/>
-          <w:numId w:val="1036"/>
-        </w:numPr>
-      </w:pPr>
-      <w:r>
-        <w:t xml:space="preserve">A1. Sinh viên mở "Lịch sử" → xem danh sách các version kèm điểm và chọn 2 version để</w:t>
+          <w:numId w:val="1035"/>
+        </w:numPr>
+      </w:pPr>
+      <w:r>
+        <w:t xml:space="preserve">A1. Nộp sau hạn và bài</w:t>
       </w:r>
       <w:r>
         <w:t xml:space="preserve"> </w:t>
@@ -7395,10 +7373,77 @@
           <w:b/>
           <w:bCs/>
         </w:rPr>
-        <w:t xml:space="preserve">so sánh</w:t>
-      </w:r>
-      <w:r>
-        <w:t xml:space="preserve">: phần thêm tô xanh, phần bỏ gạch đỏ.</w:t>
+        <w:t xml:space="preserve">cho phép nộp muộn</w:t>
+      </w:r>
+      <w:r>
+        <w:t xml:space="preserve"> </w:t>
+      </w:r>
+      <w:r>
+        <w:t xml:space="preserve">→ vẫn nhận, đánh dấu "muộn" (BR-08).</w:t>
+      </w:r>
+    </w:p>
+    <w:p>
+      <w:pPr>
+        <w:pStyle w:val="FirstParagraph"/>
+      </w:pPr>
+      <w:r>
+        <w:rPr>
+          <w:b/>
+          <w:bCs/>
+        </w:rPr>
+        <w:t xml:space="preserve">Ngoại lệ</w:t>
+      </w:r>
+    </w:p>
+    <w:p>
+      <w:pPr>
+        <w:pStyle w:val="Compact"/>
+        <w:numPr>
+          <w:ilvl w:val="0"/>
+          <w:numId w:val="1036"/>
+        </w:numPr>
+      </w:pPr>
+      <w:r>
+        <w:t xml:space="preserve">E1. Nộp sau hạn và bài</w:t>
+      </w:r>
+      <w:r>
+        <w:t xml:space="preserve"> </w:t>
+      </w:r>
+      <w:r>
+        <w:rPr>
+          <w:b/>
+          <w:bCs/>
+        </w:rPr>
+        <w:t xml:space="preserve">không cho nộp muộn</w:t>
+      </w:r>
+      <w:r>
+        <w:t xml:space="preserve"> </w:t>
+      </w:r>
+      <w:r>
+        <w:t xml:space="preserve">→ từ chối, báo "Đã quá hạn nộp" (BR-08).</w:t>
+      </w:r>
+    </w:p>
+    <w:p>
+      <w:pPr>
+        <w:pStyle w:val="Compact"/>
+        <w:numPr>
+          <w:ilvl w:val="0"/>
+          <w:numId w:val="1036"/>
+        </w:numPr>
+      </w:pPr>
+      <w:r>
+        <w:t xml:space="preserve">E2. Phần đã nộp và không ở trạng thái Yêu cầu sửa → từ chối nộp lại.</w:t>
+      </w:r>
+    </w:p>
+    <w:p>
+      <w:pPr>
+        <w:pStyle w:val="Compact"/>
+        <w:numPr>
+          <w:ilvl w:val="0"/>
+          <w:numId w:val="1036"/>
+        </w:numPr>
+      </w:pPr>
+      <w:r>
+        <w:t xml:space="preserve">E3. Mất mạng khi đang nộp → client báo lỗi và giữ nguyên nội dung. Sinh viên nộp lại khi có mạng. Server chống tạo trùng version cho cùng một lần bấm.</w:t>
       </w:r>
     </w:p>
     <w:p>
@@ -7409,13 +7454,13 @@
       </w:r>
     </w:p>
     <w:bookmarkEnd w:id="43"/>
-    <w:bookmarkStart w:id="44" w:name="uc-29--trao-đổi-chat"/>
+    <w:bookmarkStart w:id="44" w:name="uc-26--sửa-bài-và-nộp-lại"/>
     <w:p>
       <w:pPr>
         <w:pStyle w:val="Heading3"/>
       </w:pPr>
       <w:r>
-        <w:t xml:space="preserve">UC-29 · Trao đổi (chat)</w:t>
+        <w:t xml:space="preserve">UC-26 · Sửa bài và nộp lại</w:t>
       </w:r>
     </w:p>
     <w:tbl>
@@ -7474,7 +7519,7 @@
               <w:pStyle w:val="Compact"/>
             </w:pPr>
             <w:r>
-              <w:t xml:space="preserve">Giáo viên, Sinh viên</w:t>
+              <w:t xml:space="preserve">Sinh viên</w:t>
             </w:r>
           </w:p>
         </w:tc>
@@ -7498,7 +7543,31 @@
               <w:pStyle w:val="Compact"/>
             </w:pPr>
             <w:r>
-              <w:t xml:space="preserve">Nhắn tin realtime qua WebSocket. Có hai loại kênh: kênh riêng của một</w:t>
+              <w:t xml:space="preserve">Viết lại theo nhận xét của giáo viên và nộp version mới.</w:t>
+            </w:r>
+          </w:p>
+        </w:tc>
+      </w:tr>
+      <w:tr>
+        <w:tc>
+          <w:tcPr/>
+          <w:p>
+            <w:pPr>
+              <w:pStyle w:val="Compact"/>
+            </w:pPr>
+            <w:r>
+              <w:t xml:space="preserve">Tiền điều kiện</w:t>
+            </w:r>
+          </w:p>
+        </w:tc>
+        <w:tc>
+          <w:tcPr/>
+          <w:p>
+            <w:pPr>
+              <w:pStyle w:val="Compact"/>
+            </w:pPr>
+            <w:r>
+              <w:t xml:space="preserve">Bài nộp đang ở trạng thái</w:t>
             </w:r>
             <w:r>
               <w:t xml:space="preserve"> </w:t>
@@ -7508,50 +7577,10 @@
                 <w:b/>
                 <w:bCs/>
               </w:rPr>
-              <w:t xml:space="preserve">bài nộp</w:t>
-            </w:r>
-            <w:r>
-              <w:t xml:space="preserve"> </w:t>
-            </w:r>
-            <w:r>
-              <w:t xml:space="preserve">(giữa giáo viên và sinh viên đó) và kênh chung của</w:t>
-            </w:r>
-            <w:r>
-              <w:t xml:space="preserve"> </w:t>
-            </w:r>
-            <w:r>
-              <w:rPr>
-                <w:b/>
-                <w:bCs/>
-              </w:rPr>
-              <w:t xml:space="preserve">lớp</w:t>
-            </w:r>
-            <w:r>
-              <w:t xml:space="preserve">.</w:t>
-            </w:r>
-          </w:p>
-        </w:tc>
-      </w:tr>
-      <w:tr>
-        <w:tc>
-          <w:tcPr/>
-          <w:p>
-            <w:pPr>
-              <w:pStyle w:val="Compact"/>
-            </w:pPr>
-            <w:r>
-              <w:t xml:space="preserve">Tiền điều kiện</w:t>
-            </w:r>
-          </w:p>
-        </w:tc>
-        <w:tc>
-          <w:tcPr/>
-          <w:p>
-            <w:pPr>
-              <w:pStyle w:val="Compact"/>
-            </w:pPr>
-            <w:r>
-              <w:t xml:space="preserve">Người dùng thuộc kênh: là chủ bài nộp hoặc giáo viên của bài; hoặc là thành viên hoặc giáo viên của lớp.</w:t>
+              <w:t xml:space="preserve">Yêu cầu sửa</w:t>
+            </w:r>
+            <w:r>
+              <w:t xml:space="preserve">, chưa vượt số lần sửa tối đa (BR-10).</w:t>
             </w:r>
           </w:p>
         </w:tc>
@@ -7575,17 +7604,7 @@
               <w:pStyle w:val="Compact"/>
             </w:pPr>
             <w:r>
-              <w:t xml:space="preserve">Tin nhắn được lưu DB và tới mọi người đang mở kênh.</w:t>
-            </w:r>
-            <w:r>
-              <w:t xml:space="preserve"> </w:t>
-            </w:r>
-            <w:r>
-              <w:rPr>
-                <w:i/>
-                <w:iCs/>
-              </w:rPr>
-              <w:t xml:space="preserve">(Đã cài ở bước 9b.)</w:t>
+              <w:t xml:space="preserve">Có version mới. Bài nộp quay lại trạng thái Đã nộp.</w:t>
             </w:r>
           </w:p>
         </w:tc>
@@ -7612,7 +7631,7 @@
         </w:numPr>
       </w:pPr>
       <w:r>
-        <w:t xml:space="preserve">Người dùng mở kênh. Hệ thống tải 50 tin gần nhất; kéo lên để tải thêm.</w:t>
+        <w:t xml:space="preserve">Sinh viên mở bài có nhãn "Cần sửa" và đọc lời nhắn, hạn sửa, nhận xét của giáo viên.</w:t>
       </w:r>
     </w:p>
     <w:p>
@@ -7624,7 +7643,7 @@
         </w:numPr>
       </w:pPr>
       <w:r>
-        <w:t xml:space="preserve">Khi người dùng gõ, những người khác thấy "… đang gõ".</w:t>
+        <w:t xml:space="preserve">Hệ thống nạp nội dung version mới nhất vào ô soạn để sinh viên sửa tiếp.</w:t>
       </w:r>
     </w:p>
     <w:p>
@@ -7636,7 +7655,7 @@
         </w:numPr>
       </w:pPr>
       <w:r>
-        <w:t xml:space="preserve">Người dùng gửi tin. Hệ thống lưu DB rồi phát tới mọi người trong kênh.</w:t>
+        <w:t xml:space="preserve">Sinh viên sửa bài. Hệ thống tự lưu nháp như UC-23.</w:t>
       </w:r>
     </w:p>
     <w:p>
@@ -7648,19 +7667,35 @@
         </w:numPr>
       </w:pPr>
       <w:r>
-        <w:t xml:space="preserve">Khi người nhận mở xem, hệ thống cập nhật trạng thái "đã xem".</w:t>
-      </w:r>
-    </w:p>
-    <w:p>
-      <w:pPr>
-        <w:pStyle w:val="FirstParagraph"/>
-      </w:pPr>
+        <w:t xml:space="preserve">Sinh viên nộp như UC-24. Hạn áp dụng là</w:t>
+      </w:r>
+      <w:r>
+        <w:t xml:space="preserve"> </w:t>
+      </w:r>
       <w:r>
         <w:rPr>
           <w:b/>
           <w:bCs/>
         </w:rPr>
-        <w:t xml:space="preserve">Ngoại lệ</w:t>
+        <w:t xml:space="preserve">hạn sửa</w:t>
+      </w:r>
+      <w:r>
+        <w:t xml:space="preserve"> </w:t>
+      </w:r>
+      <w:r>
+        <w:t xml:space="preserve">(BR-07).</w:t>
+      </w:r>
+    </w:p>
+    <w:p>
+      <w:pPr>
+        <w:pStyle w:val="FirstParagraph"/>
+      </w:pPr>
+      <w:r>
+        <w:rPr>
+          <w:b/>
+          <w:bCs/>
+        </w:rPr>
+        <w:t xml:space="preserve">Luồng thay thế</w:t>
       </w:r>
     </w:p>
     <w:p>
@@ -7672,40 +7707,20 @@
         </w:numPr>
       </w:pPr>
       <w:r>
-        <w:t xml:space="preserve">E1. Người dùng không thuộc kênh → server từ chối đăng ký kênh.</w:t>
-      </w:r>
-    </w:p>
-    <w:p>
-      <w:pPr>
-        <w:pStyle w:val="Compact"/>
-        <w:numPr>
-          <w:ilvl w:val="0"/>
-          <w:numId w:val="1038"/>
-        </w:numPr>
-      </w:pPr>
-      <w:r>
-        <w:t xml:space="preserve">E2. Mất kết nối → tin chưa gửi được đánh dấu "chưa gửi", có nút gửi lại. Gửi lại cùng mã tin (</w:t>
-      </w:r>
-      <w:r>
-        <w:rPr>
-          <w:rStyle w:val="VerbatimChar"/>
-        </w:rPr>
-        <w:t xml:space="preserve">clientMsgId</w:t>
-      </w:r>
-      <w:r>
-        <w:t xml:space="preserve">) thì server không lưu trùng.</w:t>
-      </w:r>
-    </w:p>
-    <w:p>
-      <w:pPr>
-        <w:pStyle w:val="Compact"/>
-        <w:numPr>
-          <w:ilvl w:val="0"/>
-          <w:numId w:val="1038"/>
-        </w:numPr>
-      </w:pPr>
-      <w:r>
-        <w:t xml:space="preserve">E3. Tin rỗng hoặc dài quá 4000 ký tự → báo lỗi riêng người gửi, không lưu.</w:t>
+        <w:t xml:space="preserve">A1. Sinh viên mở "Lịch sử" → xem danh sách các version kèm điểm và chọn 2 version để</w:t>
+      </w:r>
+      <w:r>
+        <w:t xml:space="preserve"> </w:t>
+      </w:r>
+      <w:r>
+        <w:rPr>
+          <w:b/>
+          <w:bCs/>
+        </w:rPr>
+        <w:t xml:space="preserve">so sánh</w:t>
+      </w:r>
+      <w:r>
+        <w:t xml:space="preserve">: phần thêm tô xanh, phần bỏ gạch đỏ.</w:t>
       </w:r>
     </w:p>
     <w:p>
@@ -7716,13 +7731,13 @@
       </w:r>
     </w:p>
     <w:bookmarkEnd w:id="44"/>
-    <w:bookmarkStart w:id="45" w:name="uc-30--nhắc-hạn-nộp-tự-động"/>
+    <w:bookmarkStart w:id="45" w:name="uc-29--trao-đổi-chat"/>
     <w:p>
       <w:pPr>
         <w:pStyle w:val="Heading3"/>
       </w:pPr>
       <w:r>
-        <w:t xml:space="preserve">UC-30 · Nhắc hạn nộp tự động</w:t>
+        <w:t xml:space="preserve">UC-29 · Trao đổi (chat)</w:t>
       </w:r>
     </w:p>
     <w:tbl>
@@ -7781,7 +7796,7 @@
               <w:pStyle w:val="Compact"/>
             </w:pPr>
             <w:r>
-              <w:t xml:space="preserve">Bộ lập lịch. Tác nhân phụ: Sinh viên, máy chủ email.</w:t>
+              <w:t xml:space="preserve">Giáo viên, Sinh viên</w:t>
             </w:r>
           </w:p>
         </w:tc>
@@ -7805,7 +7820,46 @@
               <w:pStyle w:val="Compact"/>
             </w:pPr>
             <w:r>
-              <w:t xml:space="preserve">Định kỳ nhắc sinh viên chưa nộp khi sắp tới hạn.</w:t>
+              <w:t xml:space="preserve">Nhắn tin realtime qua WebSocket. Có kênh riêng của một</w:t>
+            </w:r>
+            <w:r>
+              <w:t xml:space="preserve"> </w:t>
+            </w:r>
+            <w:r>
+              <w:rPr>
+                <w:b/>
+                <w:bCs/>
+              </w:rPr>
+              <w:t xml:space="preserve">bài nộp</w:t>
+            </w:r>
+            <w:r>
+              <w:t xml:space="preserve">, kênh</w:t>
+            </w:r>
+            <w:r>
+              <w:t xml:space="preserve"> </w:t>
+            </w:r>
+            <w:r>
+              <w:rPr>
+                <w:b/>
+                <w:bCs/>
+              </w:rPr>
+              <w:t xml:space="preserve">trao đổi riêng giáo viên–học sinh</w:t>
+            </w:r>
+            <w:r>
+              <w:t xml:space="preserve">, và kênh chung của</w:t>
+            </w:r>
+            <w:r>
+              <w:t xml:space="preserve"> </w:t>
+            </w:r>
+            <w:r>
+              <w:rPr>
+                <w:b/>
+                <w:bCs/>
+              </w:rPr>
+              <w:t xml:space="preserve">lớp</w:t>
+            </w:r>
+            <w:r>
+              <w:t xml:space="preserve">.</w:t>
             </w:r>
           </w:p>
         </w:tc>
@@ -7829,7 +7883,7 @@
               <w:pStyle w:val="Compact"/>
             </w:pPr>
             <w:r>
-              <w:t xml:space="preserve">Job đang bật.</w:t>
+              <w:t xml:space="preserve">Người dùng thuộc kênh: là chủ bài nộp hoặc giáo viên của bài; là cặp giáo viên–học sinh đã mở kênh riêng; hoặc là thành viên hoặc giáo viên của lớp.</w:t>
             </w:r>
           </w:p>
         </w:tc>
@@ -7853,7 +7907,17 @@
               <w:pStyle w:val="Compact"/>
             </w:pPr>
             <w:r>
-              <w:t xml:space="preserve">Sinh viên đủ điều kiện nhận đúng một thông báo cho mỗi mốc (BR-14). Mỗi lần nhắc được ghi lại.</w:t>
+              <w:t xml:space="preserve">Tin nhắn được lưu DB và tới mọi người đang mở kênh.</w:t>
+            </w:r>
+            <w:r>
+              <w:t xml:space="preserve"> </w:t>
+            </w:r>
+            <w:r>
+              <w:rPr>
+                <w:i/>
+                <w:iCs/>
+              </w:rPr>
+              <w:t xml:space="preserve">(Đã cài ở bước 9b.)</w:t>
             </w:r>
           </w:p>
         </w:tc>
@@ -7880,7 +7944,7 @@
         </w:numPr>
       </w:pPr>
       <w:r>
-        <w:t xml:space="preserve">Cứ 15 phút, job chạy một lần.</w:t>
+        <w:t xml:space="preserve">Người dùng mở kênh. Hệ thống tải 50 tin gần nhất; kéo lên để tải thêm.</w:t>
       </w:r>
     </w:p>
     <w:p>
@@ -7892,103 +7956,42 @@
         </w:numPr>
       </w:pPr>
       <w:r>
-        <w:t xml:space="preserve">Job tìm các phần của bài đã phát hành có hạn áp dụng rơi vào mốc</w:t>
-      </w:r>
-      <w:r>
-        <w:t xml:space="preserve"> </w:t>
-      </w:r>
+        <w:t xml:space="preserve">Khi người dùng gõ, những người khác thấy "… đang gõ".</w:t>
+      </w:r>
+    </w:p>
+    <w:p>
+      <w:pPr>
+        <w:pStyle w:val="Compact"/>
+        <w:numPr>
+          <w:ilvl w:val="0"/>
+          <w:numId w:val="1039"/>
+        </w:numPr>
+      </w:pPr>
+      <w:r>
+        <w:t xml:space="preserve">Người dùng gửi tin. Hệ thống lưu DB rồi phát tới mọi người trong kênh.</w:t>
+      </w:r>
+    </w:p>
+    <w:p>
+      <w:pPr>
+        <w:pStyle w:val="Compact"/>
+        <w:numPr>
+          <w:ilvl w:val="0"/>
+          <w:numId w:val="1039"/>
+        </w:numPr>
+      </w:pPr>
+      <w:r>
+        <w:t xml:space="preserve">Khi người nhận mở xem, hệ thống cập nhật trạng thái "đã xem".</w:t>
+      </w:r>
+    </w:p>
+    <w:p>
+      <w:pPr>
+        <w:pStyle w:val="FirstParagraph"/>
+      </w:pPr>
       <w:r>
         <w:rPr>
           <w:b/>
           <w:bCs/>
         </w:rPr>
-        <w:t xml:space="preserve">còn ≤ 24 giờ</w:t>
-      </w:r>
-      <w:r>
-        <w:t xml:space="preserve"> </w:t>
-      </w:r>
-      <w:r>
-        <w:t xml:space="preserve">hoặc</w:t>
-      </w:r>
-      <w:r>
-        <w:t xml:space="preserve"> </w:t>
-      </w:r>
-      <w:r>
-        <w:rPr>
-          <w:b/>
-          <w:bCs/>
-        </w:rPr>
-        <w:t xml:space="preserve">còn ≤ 2 giờ</w:t>
-      </w:r>
-      <w:r>
-        <w:t xml:space="preserve">, bao gồm cả hạn sửa bài.</w:t>
-      </w:r>
-    </w:p>
-    <w:p>
-      <w:pPr>
-        <w:pStyle w:val="Compact"/>
-        <w:numPr>
-          <w:ilvl w:val="0"/>
-          <w:numId w:val="1039"/>
-        </w:numPr>
-      </w:pPr>
-      <w:r>
-        <w:t xml:space="preserve">Với mỗi phần, job lấy những sinh viên được giao mà</w:t>
-      </w:r>
-      <w:r>
-        <w:t xml:space="preserve"> </w:t>
-      </w:r>
-      <w:r>
-        <w:rPr>
-          <w:b/>
-          <w:bCs/>
-        </w:rPr>
-        <w:t xml:space="preserve">chưa nộp</w:t>
-      </w:r>
-      <w:r>
-        <w:t xml:space="preserve"> </w:t>
-      </w:r>
-      <w:r>
-        <w:t xml:space="preserve">(hoặc chưa nộp lại khi đang bị yêu cầu sửa), và</w:t>
-      </w:r>
-      <w:r>
-        <w:t xml:space="preserve"> </w:t>
-      </w:r>
-      <w:r>
-        <w:rPr>
-          <w:b/>
-          <w:bCs/>
-        </w:rPr>
-        <w:t xml:space="preserve">chưa được nhắc</w:t>
-      </w:r>
-      <w:r>
-        <w:t xml:space="preserve"> </w:t>
-      </w:r>
-      <w:r>
-        <w:t xml:space="preserve">ở mốc đó.</w:t>
-      </w:r>
-    </w:p>
-    <w:p>
-      <w:pPr>
-        <w:pStyle w:val="Compact"/>
-        <w:numPr>
-          <w:ilvl w:val="0"/>
-          <w:numId w:val="1039"/>
-        </w:numPr>
-      </w:pPr>
-      <w:r>
-        <w:t xml:space="preserve">Job gửi thông báo "Còn X giờ đến hạn nộp …" (UC-04) và ghi nhận đã nhắc.</w:t>
-      </w:r>
-    </w:p>
-    <w:p>
-      <w:pPr>
-        <w:pStyle w:val="FirstParagraph"/>
-      </w:pPr>
-      <w:r>
-        <w:rPr>
-          <w:b/>
-          <w:bCs/>
-        </w:rPr>
         <w:t xml:space="preserve">Ngoại lệ</w:t>
       </w:r>
     </w:p>
@@ -8001,7 +8004,40 @@
         </w:numPr>
       </w:pPr>
       <w:r>
-        <w:t xml:space="preserve">E1. Server tắt đúng lúc tới mốc → lần chạy kế tiếp vẫn bắt được, vì job tìm theo khoảng thời gian chứ không theo thời điểm chính xác. Việc ghi nhận đã nhắc đảm bảo không gửi trùng.</w:t>
+        <w:t xml:space="preserve">E1. Người dùng không thuộc kênh → server từ chối đăng ký kênh.</w:t>
+      </w:r>
+    </w:p>
+    <w:p>
+      <w:pPr>
+        <w:pStyle w:val="Compact"/>
+        <w:numPr>
+          <w:ilvl w:val="0"/>
+          <w:numId w:val="1040"/>
+        </w:numPr>
+      </w:pPr>
+      <w:r>
+        <w:t xml:space="preserve">E2. Mất kết nối → tin chưa gửi được đánh dấu "chưa gửi", có nút gửi lại. Gửi lại cùng mã tin (</w:t>
+      </w:r>
+      <w:r>
+        <w:rPr>
+          <w:rStyle w:val="VerbatimChar"/>
+        </w:rPr>
+        <w:t xml:space="preserve">clientMsgId</w:t>
+      </w:r>
+      <w:r>
+        <w:t xml:space="preserve">) thì server không lưu trùng.</w:t>
+      </w:r>
+    </w:p>
+    <w:p>
+      <w:pPr>
+        <w:pStyle w:val="Compact"/>
+        <w:numPr>
+          <w:ilvl w:val="0"/>
+          <w:numId w:val="1040"/>
+        </w:numPr>
+      </w:pPr>
+      <w:r>
+        <w:t xml:space="preserve">E3. Tin rỗng hoặc dài quá 4000 ký tự → báo lỗi riêng người gửi, không lưu.</w:t>
       </w:r>
     </w:p>
     <w:p>
@@ -8012,13 +8048,13 @@
       </w:r>
     </w:p>
     <w:bookmarkEnd w:id="45"/>
-    <w:bookmarkStart w:id="46" w:name="uc-27--uc-31--làm-bài-ở-chế-độ-thi-mức-3"/>
+    <w:bookmarkStart w:id="46" w:name="uc-30--nhắc-hạn-nộp-tự-động"/>
     <w:p>
       <w:pPr>
         <w:pStyle w:val="Heading3"/>
       </w:pPr>
       <w:r>
-        <w:t xml:space="preserve">UC-27 / UC-31 · Làm bài ở chế độ thi (Mức 3)</w:t>
+        <w:t xml:space="preserve">UC-30 · Nhắc hạn nộp tự động</w:t>
       </w:r>
     </w:p>
     <w:tbl>
@@ -8077,7 +8113,7 @@
               <w:pStyle w:val="Compact"/>
             </w:pPr>
             <w:r>
-              <w:t xml:space="preserve">Sinh viên; Bộ lập lịch (tự nộp)</w:t>
+              <w:t xml:space="preserve">Bộ lập lịch. Tác nhân phụ: Sinh viên, máy chủ email.</w:t>
             </w:r>
           </w:p>
         </w:tc>
@@ -8101,7 +8137,7 @@
               <w:pStyle w:val="Compact"/>
             </w:pPr>
             <w:r>
-              <w:t xml:space="preserve">Phần bài được bật "Chế độ thi" thì có giới hạn thời gian cứng tính từ lúc bấm Bắt đầu.</w:t>
+              <w:t xml:space="preserve">Định kỳ nhắc sinh viên chưa nộp khi sắp tới hạn.</w:t>
             </w:r>
           </w:p>
         </w:tc>
@@ -8125,7 +8161,7 @@
               <w:pStyle w:val="Compact"/>
             </w:pPr>
             <w:r>
-              <w:t xml:space="preserve">Như UC-23. Sinh viên chưa bắt đầu phiên thi của phần này.</w:t>
+              <w:t xml:space="preserve">Job đang bật.</w:t>
             </w:r>
           </w:p>
         </w:tc>
@@ -8149,7 +8185,7 @@
               <w:pStyle w:val="Compact"/>
             </w:pPr>
             <w:r>
-              <w:t xml:space="preserve">Bài được nộp bởi sinh viên, hoặc tự nộp khi hết giờ. Nhật ký sự kiện được lưu để giáo viên xem (UC-21).</w:t>
+              <w:t xml:space="preserve">Sinh viên đủ điều kiện nhận đúng một thông báo cho mỗi mốc (BR-14). Mỗi lần nhắc được ghi lại.</w:t>
             </w:r>
           </w:p>
         </w:tc>
@@ -8176,7 +8212,7 @@
         </w:numPr>
       </w:pPr>
       <w:r>
-        <w:t xml:space="preserve">Sinh viên bấm "Bắt đầu". Server tạo phiên thi với thời điểm kết thúc cố định, ví dụ 40 phút cho Task 2.</w:t>
+        <w:t xml:space="preserve">Cứ 15 phút, job chạy một lần.</w:t>
       </w:r>
     </w:p>
     <w:p>
@@ -8188,43 +8224,7 @@
         </w:numPr>
       </w:pPr>
       <w:r>
-        <w:t xml:space="preserve">Sinh viên làm bài như UC-23. Đồng hồ chạy theo giờ server.</w:t>
-      </w:r>
-    </w:p>
-    <w:p>
-      <w:pPr>
-        <w:pStyle w:val="Compact"/>
-        <w:numPr>
-          <w:ilvl w:val="0"/>
-          <w:numId w:val="1041"/>
-        </w:numPr>
-      </w:pPr>
-      <w:r>
-        <w:t xml:space="preserve">Trong lúc làm, client gửi các sự kiện qua WebSocket: rời tab, quay lại tab, dán văn bản, mất kết nối, kết nối lại.</w:t>
-      </w:r>
-    </w:p>
-    <w:p>
-      <w:pPr>
-        <w:pStyle w:val="Compact"/>
-        <w:numPr>
-          <w:ilvl w:val="0"/>
-          <w:numId w:val="1041"/>
-        </w:numPr>
-      </w:pPr>
-      <w:r>
-        <w:t xml:space="preserve">Sinh viên nộp trước giờ → như UC-24.</w:t>
-      </w:r>
-    </w:p>
-    <w:p>
-      <w:pPr>
-        <w:pStyle w:val="Compact"/>
-        <w:numPr>
-          <w:ilvl w:val="0"/>
-          <w:numId w:val="1041"/>
-        </w:numPr>
-      </w:pPr>
-      <w:r>
-        <w:t xml:space="preserve">Hết giờ mà chưa nộp →</w:t>
+        <w:t xml:space="preserve">Job tìm các phần của bài đã phát hành có hạn áp dụng rơi vào mốc</w:t>
       </w:r>
       <w:r>
         <w:t xml:space="preserve"> </w:t>
@@ -8234,24 +8234,93 @@
           <w:b/>
           <w:bCs/>
         </w:rPr>
-        <w:t xml:space="preserve">server tự nộp</w:t>
-      </w:r>
-      <w:r>
-        <w:t xml:space="preserve"> </w:t>
-      </w:r>
-      <w:r>
-        <w:t xml:space="preserve">bản nháp mới nhất (UC-31).</w:t>
-      </w:r>
-    </w:p>
-    <w:p>
-      <w:pPr>
-        <w:pStyle w:val="FirstParagraph"/>
-      </w:pPr>
+        <w:t xml:space="preserve">còn ≤ 24 giờ</w:t>
+      </w:r>
+      <w:r>
+        <w:t xml:space="preserve"> </w:t>
+      </w:r>
+      <w:r>
+        <w:t xml:space="preserve">hoặc</w:t>
+      </w:r>
+      <w:r>
+        <w:t xml:space="preserve"> </w:t>
+      </w:r>
       <w:r>
         <w:rPr>
           <w:b/>
           <w:bCs/>
         </w:rPr>
+        <w:t xml:space="preserve">còn ≤ 2 giờ</w:t>
+      </w:r>
+      <w:r>
+        <w:t xml:space="preserve">, bao gồm cả hạn sửa bài.</w:t>
+      </w:r>
+    </w:p>
+    <w:p>
+      <w:pPr>
+        <w:pStyle w:val="Compact"/>
+        <w:numPr>
+          <w:ilvl w:val="0"/>
+          <w:numId w:val="1041"/>
+        </w:numPr>
+      </w:pPr>
+      <w:r>
+        <w:t xml:space="preserve">Với mỗi phần, job lấy những sinh viên được giao mà</w:t>
+      </w:r>
+      <w:r>
+        <w:t xml:space="preserve"> </w:t>
+      </w:r>
+      <w:r>
+        <w:rPr>
+          <w:b/>
+          <w:bCs/>
+        </w:rPr>
+        <w:t xml:space="preserve">chưa nộp</w:t>
+      </w:r>
+      <w:r>
+        <w:t xml:space="preserve"> </w:t>
+      </w:r>
+      <w:r>
+        <w:t xml:space="preserve">(hoặc chưa nộp lại khi đang bị yêu cầu sửa), và</w:t>
+      </w:r>
+      <w:r>
+        <w:t xml:space="preserve"> </w:t>
+      </w:r>
+      <w:r>
+        <w:rPr>
+          <w:b/>
+          <w:bCs/>
+        </w:rPr>
+        <w:t xml:space="preserve">chưa được nhắc</w:t>
+      </w:r>
+      <w:r>
+        <w:t xml:space="preserve"> </w:t>
+      </w:r>
+      <w:r>
+        <w:t xml:space="preserve">ở mốc đó.</w:t>
+      </w:r>
+    </w:p>
+    <w:p>
+      <w:pPr>
+        <w:pStyle w:val="Compact"/>
+        <w:numPr>
+          <w:ilvl w:val="0"/>
+          <w:numId w:val="1041"/>
+        </w:numPr>
+      </w:pPr>
+      <w:r>
+        <w:t xml:space="preserve">Job gửi thông báo "Còn X giờ đến hạn nộp …" (UC-04) và ghi nhận đã nhắc.</w:t>
+      </w:r>
+    </w:p>
+    <w:p>
+      <w:pPr>
+        <w:pStyle w:val="FirstParagraph"/>
+      </w:pPr>
+      <w:r>
+        <w:rPr>
+          <w:b/>
+          <w:bCs/>
+        </w:rPr>
         <w:t xml:space="preserve">Ngoại lệ</w:t>
       </w:r>
     </w:p>
@@ -8264,7 +8333,7 @@
         </w:numPr>
       </w:pPr>
       <w:r>
-        <w:t xml:space="preserve">E1. Tải lại trang hoặc mất mạng → phiên vẫn chạy theo giờ server; vào lại thì tiếp tục với thời gian còn lại.</w:t>
+        <w:t xml:space="preserve">E1. Server tắt đúng lúc tới mốc → lần chạy kế tiếp vẫn bắt được, vì job tìm theo khoảng thời gian chứ không theo thời điểm chính xác. Việc ghi nhận đã nhắc đảm bảo không gửi trùng.</w:t>
       </w:r>
     </w:p>
     <w:p>
@@ -8275,13 +8344,13 @@
       </w:r>
     </w:p>
     <w:bookmarkEnd w:id="46"/>
-    <w:bookmarkStart w:id="47" w:name="X60aede1df8e0c1a1199d78aec46d7a9e5aad14d"/>
+    <w:bookmarkStart w:id="47" w:name="uc-27--uc-31--làm-bài-ở-chế-độ-thi-mức-3"/>
     <w:p>
       <w:pPr>
         <w:pStyle w:val="Heading3"/>
       </w:pPr>
       <w:r>
-        <w:t xml:space="preserve">3.13 Các use case quản lý đơn giản</w:t>
+        <w:t xml:space="preserve">UC-27 / UC-31 · Làm bài ở chế độ thi (Mức 3)</w:t>
       </w:r>
     </w:p>
     <w:tbl>
@@ -8305,422 +8374,231 @@
               <w:pStyle w:val="Compact"/>
             </w:pPr>
             <w:r>
-              <w:t xml:space="preserve">Mã</w:t>
-            </w:r>
-          </w:p>
-        </w:tc>
-        <w:tc>
-          <w:tcPr/>
-          <w:p>
-            <w:pPr>
-              <w:pStyle w:val="Compact"/>
-            </w:pPr>
-            <w:r>
-              <w:t xml:space="preserve">Mô tả ngắn</w:t>
-            </w:r>
-          </w:p>
-        </w:tc>
-      </w:tr>
-      <w:tr>
-        <w:tc>
-          <w:tcPr/>
-          <w:p>
-            <w:pPr>
-              <w:pStyle w:val="Compact"/>
-            </w:pPr>
-            <w:r>
-              <w:t xml:space="preserve">UC-03 Đăng xuất</w:t>
-            </w:r>
-          </w:p>
-        </w:tc>
-        <w:tc>
-          <w:tcPr/>
-          <w:p>
-            <w:pPr>
-              <w:pStyle w:val="Compact"/>
-            </w:pPr>
-            <w:r>
-              <w:t xml:space="preserve">Thu hồi refresh token, đóng WebSocket, xoá token ở trình duyệt, chuyển về trang đăng nhập.</w:t>
-            </w:r>
-          </w:p>
-        </w:tc>
-      </w:tr>
-      <w:tr>
-        <w:tc>
-          <w:tcPr/>
-          <w:p>
-            <w:pPr>
-              <w:pStyle w:val="Compact"/>
-            </w:pPr>
-            <w:r>
-              <w:t xml:space="preserve">UC-04 Nhận và xem thông báo</w:t>
-            </w:r>
-          </w:p>
-        </w:tc>
-        <w:tc>
-          <w:tcPr/>
-          <w:p>
-            <w:pPr>
-              <w:pStyle w:val="Compact"/>
-            </w:pPr>
-            <w:r>
-              <w:t xml:space="preserve">Thông báo lưu DB rồi đẩy qua WebSocket tới đúng người. Chuông hiện số chưa đọc, toast hiện ngay. Có trang danh sách, đánh dấu một hoặc tất cả là đã đọc. Kết nối lại thì lấy các thông báo bị lỡ. Một số loại thông báo gửi kèm email.</w:t>
-            </w:r>
-          </w:p>
-        </w:tc>
-      </w:tr>
-      <w:tr>
-        <w:tc>
-          <w:tcPr/>
-          <w:p>
-            <w:pPr>
-              <w:pStyle w:val="Compact"/>
-            </w:pPr>
-            <w:r>
-              <w:t xml:space="preserve">UC-05 Quản lý tài khoản giáo viên</w:t>
-            </w:r>
-          </w:p>
-        </w:tc>
-        <w:tc>
-          <w:tcPr/>
-          <w:p>
-            <w:pPr>
-              <w:pStyle w:val="Compact"/>
-            </w:pPr>
-            <w:r>
-              <w:t xml:space="preserve">Admin tạo giáo viên (tên đăng nhập, họ tên, email, mật khẩu tạm), sửa thông tin, khoá/mở, đặt lại mật khẩu. Giáo viên mới bị bắt đổi mật khẩu.</w:t>
-            </w:r>
-          </w:p>
-        </w:tc>
-      </w:tr>
-      <w:tr>
-        <w:tc>
-          <w:tcPr/>
-          <w:p>
-            <w:pPr>
-              <w:pStyle w:val="Compact"/>
-            </w:pPr>
-            <w:r>
-              <w:t xml:space="preserve">UC-06 Quản lý người dùng</w:t>
-            </w:r>
-          </w:p>
-        </w:tc>
-        <w:tc>
-          <w:tcPr/>
-          <w:p>
-            <w:pPr>
-              <w:pStyle w:val="Compact"/>
-            </w:pPr>
-            <w:r>
-              <w:t xml:space="preserve">Admin tìm theo tên, mã sinh viên, vai trò, trạng thái; xem chi tiết; khoá/mở tài khoản. Tài khoản bị khoá bị đăng xuất ngay.</w:t>
-            </w:r>
-          </w:p>
-        </w:tc>
-      </w:tr>
-      <w:tr>
-        <w:tc>
-          <w:tcPr/>
-          <w:p>
-            <w:pPr>
-              <w:pStyle w:val="Compact"/>
-            </w:pPr>
-            <w:r>
-              <w:t xml:space="preserve">UC-07 Xem nhật ký hệ thống</w:t>
-            </w:r>
-          </w:p>
-        </w:tc>
-        <w:tc>
-          <w:tcPr/>
-          <w:p>
-            <w:pPr>
-              <w:pStyle w:val="Compact"/>
-            </w:pPr>
-            <w:r>
-              <w:t xml:space="preserve">Lọc audit log theo người thực hiện, hành động, thời gian, IP.</w:t>
-            </w:r>
-          </w:p>
-        </w:tc>
-      </w:tr>
-      <w:tr>
-        <w:tc>
-          <w:tcPr/>
-          <w:p>
-            <w:pPr>
-              <w:pStyle w:val="Compact"/>
-            </w:pPr>
-            <w:r>
-              <w:t xml:space="preserve">UC-08 Quản lý phiên đăng nhập</w:t>
-            </w:r>
-          </w:p>
-        </w:tc>
-        <w:tc>
-          <w:tcPr/>
-          <w:p>
-            <w:pPr>
-              <w:pStyle w:val="Compact"/>
-            </w:pPr>
-            <w:r>
-              <w:t xml:space="preserve">Xem các phiên đang hoạt động (thiết bị, IP, thời gian) và buộc đăng xuất một phiên.</w:t>
-            </w:r>
-          </w:p>
-        </w:tc>
-      </w:tr>
-      <w:tr>
-        <w:tc>
-          <w:tcPr/>
-          <w:p>
-            <w:pPr>
-              <w:pStyle w:val="Compact"/>
-            </w:pPr>
-            <w:r>
-              <w:t xml:space="preserve">UC-09 Thống kê toàn hệ thống</w:t>
-            </w:r>
-          </w:p>
-        </w:tc>
-        <w:tc>
-          <w:tcPr/>
-          <w:p>
-            <w:pPr>
-              <w:pStyle w:val="Compact"/>
-            </w:pPr>
-            <w:r>
-              <w:t xml:space="preserve">Số người dùng theo vai trò, số lớp, số bài tập, số bài nộp theo ngày.</w:t>
-            </w:r>
-          </w:p>
-        </w:tc>
-      </w:tr>
-      <w:tr>
-        <w:tc>
-          <w:tcPr/>
-          <w:p>
-            <w:pPr>
-              <w:pStyle w:val="Compact"/>
-            </w:pPr>
-            <w:r>
-              <w:t xml:space="preserve">UC-10 Quản lý lớp học</w:t>
-            </w:r>
-          </w:p>
-        </w:tc>
-        <w:tc>
-          <w:tcPr/>
-          <w:p>
-            <w:pPr>
-              <w:pStyle w:val="Compact"/>
-            </w:pPr>
-            <w:r>
-              <w:t xml:space="preserve">Giáo viên tạo, sửa, xoá lớp (mã lớp duy nhất), xem thành viên, thêm sinh viên đã có tài khoản, xoá sinh viên khỏi lớp. Xoá lớp không xoá tài khoản sinh viên.</w:t>
-            </w:r>
-          </w:p>
-        </w:tc>
-      </w:tr>
-      <w:tr>
-        <w:tc>
-          <w:tcPr/>
-          <w:p>
-            <w:pPr>
-              <w:pStyle w:val="Compact"/>
-            </w:pPr>
-            <w:r>
-              <w:t xml:space="preserve">UC-15 Đóng, nhân bản bài</w:t>
-            </w:r>
-          </w:p>
-        </w:tc>
-        <w:tc>
-          <w:tcPr/>
-          <w:p>
-            <w:pPr>
-              <w:pStyle w:val="Compact"/>
-            </w:pPr>
-            <w:r>
-              <w:t xml:space="preserve">Đóng thì sinh viên không nộp được nữa nhưng vẫn xem được kết quả. Nhân bản tạo bản Nháp mới gồm đủ phần và rubric, chưa có người nhận.</w:t>
-            </w:r>
-          </w:p>
-        </w:tc>
-      </w:tr>
-      <w:tr>
-        <w:tc>
-          <w:tcPr/>
-          <w:p>
-            <w:pPr>
-              <w:pStyle w:val="Compact"/>
-            </w:pPr>
-            <w:r>
-              <w:t xml:space="preserve">UC-19 Thống kê và xuất bảng điểm</w:t>
-            </w:r>
-          </w:p>
-        </w:tc>
-        <w:tc>
-          <w:tcPr/>
-          <w:p>
-            <w:pPr>
-              <w:pStyle w:val="Compact"/>
-            </w:pPr>
-            <w:r>
-              <w:t xml:space="preserve">Thống kê một bài (điểm trung bình mỗi tiêu chí, phân bố band, tỉ lệ đúng hạn), theo sinh viên, theo lớp. Xuất</w:t>
-            </w:r>
-            <w:r>
-              <w:t xml:space="preserve"> </w:t>
-            </w:r>
-            <w:r>
-              <w:rPr>
-                <w:rStyle w:val="VerbatimChar"/>
-              </w:rPr>
-              <w:t xml:space="preserve">.xlsx</w:t>
-            </w:r>
-            <w:r>
-              <w:t xml:space="preserve"> </w:t>
-            </w:r>
-            <w:r>
-              <w:t xml:space="preserve">bảng điểm.</w:t>
-            </w:r>
-          </w:p>
-        </w:tc>
-      </w:tr>
-      <w:tr>
-        <w:tc>
-          <w:tcPr/>
-          <w:p>
-            <w:pPr>
-              <w:pStyle w:val="Compact"/>
-            </w:pPr>
-            <w:r>
-              <w:t xml:space="preserve">UC-20 Ngân hàng đề</w:t>
-            </w:r>
-          </w:p>
-        </w:tc>
-        <w:tc>
-          <w:tcPr/>
-          <w:p>
-            <w:pPr>
-              <w:pStyle w:val="Compact"/>
-            </w:pPr>
-            <w:r>
-              <w:t xml:space="preserve">Lưu một phần (đề + rubric) vào ngân hàng, gắn tag dạng đề, tìm và dùng lại khi soạn bài.</w:t>
-            </w:r>
-          </w:p>
-        </w:tc>
-      </w:tr>
-      <w:tr>
-        <w:tc>
-          <w:tcPr/>
-          <w:p>
-            <w:pPr>
-              <w:pStyle w:val="Compact"/>
-            </w:pPr>
-            <w:r>
-              <w:t xml:space="preserve">UC-21 Nhật ký chế độ thi</w:t>
-            </w:r>
-          </w:p>
-        </w:tc>
-        <w:tc>
-          <w:tcPr/>
-          <w:p>
-            <w:pPr>
-              <w:pStyle w:val="Compact"/>
-            </w:pPr>
-            <w:r>
-              <w:t xml:space="preserve">Giáo viên xem dòng thời gian sự kiện của từng sinh viên trong phiên thi.</w:t>
-            </w:r>
-          </w:p>
-        </w:tc>
-      </w:tr>
-      <w:tr>
-        <w:tc>
-          <w:tcPr/>
-          <w:p>
-            <w:pPr>
-              <w:pStyle w:val="Compact"/>
-            </w:pPr>
-            <w:r>
-              <w:t xml:space="preserve">UC-22 Xem bài được giao</w:t>
-            </w:r>
-          </w:p>
-        </w:tc>
-        <w:tc>
-          <w:tcPr/>
-          <w:p>
-            <w:pPr>
-              <w:pStyle w:val="Compact"/>
-            </w:pPr>
-            <w:r>
-              <w:t xml:space="preserve">Danh sách theo tab Cần làm / Sắp hết hạn (dưới 24 giờ) / Quá hạn / Đã nộp / Cần sửa. Mỗi bài có tiến độ từng phần và hạn nộp.</w:t>
-            </w:r>
-          </w:p>
-        </w:tc>
-      </w:tr>
-      <w:tr>
-        <w:tc>
-          <w:tcPr/>
-          <w:p>
-            <w:pPr>
-              <w:pStyle w:val="Compact"/>
-            </w:pPr>
-            <w:r>
-              <w:t xml:space="preserve">UC-25 Xem kết quả chấm</w:t>
-            </w:r>
-          </w:p>
-        </w:tc>
-        <w:tc>
-          <w:tcPr/>
-          <w:p>
-            <w:pPr>
-              <w:pStyle w:val="Compact"/>
-            </w:pPr>
-            <w:r>
-              <w:t xml:space="preserve">Chỉ khi đã trả bài: band từng phần và cả bài, điểm và nhận xét từng tiêu chí, checklist, nhận xét chung, nhận xét inline tô màu trên bài.</w:t>
-            </w:r>
-          </w:p>
-        </w:tc>
-      </w:tr>
-      <w:tr>
-        <w:tc>
-          <w:tcPr/>
-          <w:p>
-            <w:pPr>
-              <w:pStyle w:val="Compact"/>
-            </w:pPr>
-            <w:r>
-              <w:t xml:space="preserve">UC-28 Kết quả học tập</w:t>
-            </w:r>
-          </w:p>
-        </w:tc>
-        <w:tc>
-          <w:tcPr/>
-          <w:p>
-            <w:pPr>
-              <w:pStyle w:val="Compact"/>
-            </w:pPr>
-            <w:r>
-              <w:t xml:space="preserve">Biểu đồ band theo thời gian, điểm trung bình theo tiêu chí, số bài nộp muộn.</w:t>
-            </w:r>
-          </w:p>
-        </w:tc>
-      </w:tr>
-      <w:tr>
-        <w:tc>
-          <w:tcPr/>
-          <w:p>
-            <w:pPr>
-              <w:pStyle w:val="Compact"/>
-            </w:pPr>
-            <w:r>
-              <w:t xml:space="preserve">UC-32 Kiểm tra đạo văn</w:t>
-            </w:r>
-          </w:p>
-        </w:tc>
-        <w:tc>
-          <w:tcPr/>
-          <w:p>
-            <w:pPr>
-              <w:pStyle w:val="Compact"/>
-            </w:pPr>
-            <w:r>
-              <w:t xml:space="preserve">Sau mỗi lần nộp, chạy nền: so độ giống nhau với các bài cùng phần; vượt ngưỡng thì gắn cờ cho giáo viên.</w:t>
+              <w:t xml:space="preserve">Mục</w:t>
+            </w:r>
+          </w:p>
+        </w:tc>
+        <w:tc>
+          <w:tcPr/>
+          <w:p>
+            <w:pPr>
+              <w:pStyle w:val="Compact"/>
+            </w:pPr>
+            <w:r>
+              <w:t xml:space="preserve">Nội dung</w:t>
+            </w:r>
+          </w:p>
+        </w:tc>
+      </w:tr>
+      <w:tr>
+        <w:tc>
+          <w:tcPr/>
+          <w:p>
+            <w:pPr>
+              <w:pStyle w:val="Compact"/>
+            </w:pPr>
+            <w:r>
+              <w:t xml:space="preserve">Tác nhân</w:t>
+            </w:r>
+          </w:p>
+        </w:tc>
+        <w:tc>
+          <w:tcPr/>
+          <w:p>
+            <w:pPr>
+              <w:pStyle w:val="Compact"/>
+            </w:pPr>
+            <w:r>
+              <w:t xml:space="preserve">Sinh viên; Bộ lập lịch (tự nộp)</w:t>
+            </w:r>
+          </w:p>
+        </w:tc>
+      </w:tr>
+      <w:tr>
+        <w:tc>
+          <w:tcPr/>
+          <w:p>
+            <w:pPr>
+              <w:pStyle w:val="Compact"/>
+            </w:pPr>
+            <w:r>
+              <w:t xml:space="preserve">Mô tả</w:t>
+            </w:r>
+          </w:p>
+        </w:tc>
+        <w:tc>
+          <w:tcPr/>
+          <w:p>
+            <w:pPr>
+              <w:pStyle w:val="Compact"/>
+            </w:pPr>
+            <w:r>
+              <w:t xml:space="preserve">Phần bài được bật "Chế độ thi" thì có giới hạn thời gian cứng tính từ lúc bấm Bắt đầu.</w:t>
+            </w:r>
+          </w:p>
+        </w:tc>
+      </w:tr>
+      <w:tr>
+        <w:tc>
+          <w:tcPr/>
+          <w:p>
+            <w:pPr>
+              <w:pStyle w:val="Compact"/>
+            </w:pPr>
+            <w:r>
+              <w:t xml:space="preserve">Tiền điều kiện</w:t>
+            </w:r>
+          </w:p>
+        </w:tc>
+        <w:tc>
+          <w:tcPr/>
+          <w:p>
+            <w:pPr>
+              <w:pStyle w:val="Compact"/>
+            </w:pPr>
+            <w:r>
+              <w:t xml:space="preserve">Như UC-23. Sinh viên chưa bắt đầu phiên thi của phần này.</w:t>
+            </w:r>
+          </w:p>
+        </w:tc>
+      </w:tr>
+      <w:tr>
+        <w:tc>
+          <w:tcPr/>
+          <w:p>
+            <w:pPr>
+              <w:pStyle w:val="Compact"/>
+            </w:pPr>
+            <w:r>
+              <w:t xml:space="preserve">Hậu điều kiện</w:t>
+            </w:r>
+          </w:p>
+        </w:tc>
+        <w:tc>
+          <w:tcPr/>
+          <w:p>
+            <w:pPr>
+              <w:pStyle w:val="Compact"/>
+            </w:pPr>
+            <w:r>
+              <w:t xml:space="preserve">Bài được nộp bởi sinh viên, hoặc tự nộp khi hết giờ. Nhật ký sự kiện được lưu để giáo viên xem (UC-21).</w:t>
             </w:r>
           </w:p>
         </w:tc>
       </w:tr>
     </w:tbl>
+    <w:p>
+      <w:pPr>
+        <w:pStyle w:val="BodyText"/>
+      </w:pPr>
+      <w:r>
+        <w:rPr>
+          <w:b/>
+          <w:bCs/>
+        </w:rPr>
+        <w:t xml:space="preserve">Luồng chính</w:t>
+      </w:r>
+    </w:p>
+    <w:p>
+      <w:pPr>
+        <w:pStyle w:val="Compact"/>
+        <w:numPr>
+          <w:ilvl w:val="0"/>
+          <w:numId w:val="1043"/>
+        </w:numPr>
+      </w:pPr>
+      <w:r>
+        <w:t xml:space="preserve">Sinh viên bấm "Bắt đầu". Server tạo phiên thi với thời điểm kết thúc cố định, ví dụ 40 phút cho Task 2.</w:t>
+      </w:r>
+    </w:p>
+    <w:p>
+      <w:pPr>
+        <w:pStyle w:val="Compact"/>
+        <w:numPr>
+          <w:ilvl w:val="0"/>
+          <w:numId w:val="1043"/>
+        </w:numPr>
+      </w:pPr>
+      <w:r>
+        <w:t xml:space="preserve">Sinh viên làm bài như UC-23. Đồng hồ chạy theo giờ server.</w:t>
+      </w:r>
+    </w:p>
+    <w:p>
+      <w:pPr>
+        <w:pStyle w:val="Compact"/>
+        <w:numPr>
+          <w:ilvl w:val="0"/>
+          <w:numId w:val="1043"/>
+        </w:numPr>
+      </w:pPr>
+      <w:r>
+        <w:t xml:space="preserve">Trong lúc làm, client gửi các sự kiện qua WebSocket: rời tab, quay lại tab, dán văn bản, mất kết nối, kết nối lại.</w:t>
+      </w:r>
+    </w:p>
+    <w:p>
+      <w:pPr>
+        <w:pStyle w:val="Compact"/>
+        <w:numPr>
+          <w:ilvl w:val="0"/>
+          <w:numId w:val="1043"/>
+        </w:numPr>
+      </w:pPr>
+      <w:r>
+        <w:t xml:space="preserve">Sinh viên nộp trước giờ → như UC-24.</w:t>
+      </w:r>
+    </w:p>
+    <w:p>
+      <w:pPr>
+        <w:pStyle w:val="Compact"/>
+        <w:numPr>
+          <w:ilvl w:val="0"/>
+          <w:numId w:val="1043"/>
+        </w:numPr>
+      </w:pPr>
+      <w:r>
+        <w:t xml:space="preserve">Hết giờ mà chưa nộp →</w:t>
+      </w:r>
+      <w:r>
+        <w:t xml:space="preserve"> </w:t>
+      </w:r>
+      <w:r>
+        <w:rPr>
+          <w:b/>
+          <w:bCs/>
+        </w:rPr>
+        <w:t xml:space="preserve">server tự nộp</w:t>
+      </w:r>
+      <w:r>
+        <w:t xml:space="preserve"> </w:t>
+      </w:r>
+      <w:r>
+        <w:t xml:space="preserve">bản nháp mới nhất (UC-31).</w:t>
+      </w:r>
+    </w:p>
+    <w:p>
+      <w:pPr>
+        <w:pStyle w:val="FirstParagraph"/>
+      </w:pPr>
+      <w:r>
+        <w:rPr>
+          <w:b/>
+          <w:bCs/>
+        </w:rPr>
+        <w:t xml:space="preserve">Ngoại lệ</w:t>
+      </w:r>
+    </w:p>
+    <w:p>
+      <w:pPr>
+        <w:pStyle w:val="Compact"/>
+        <w:numPr>
+          <w:ilvl w:val="0"/>
+          <w:numId w:val="1044"/>
+        </w:numPr>
+      </w:pPr>
+      <w:r>
+        <w:t xml:space="preserve">E1. Tải lại trang hoặc mất mạng → phiên vẫn chạy theo giờ server; vào lại thì tiếp tục với thời gian còn lại.</w:t>
+      </w:r>
+    </w:p>
     <w:p>
       <w:r>
         <w:pict>
@@ -8729,14 +8607,13 @@
       </w:r>
     </w:p>
     <w:bookmarkEnd w:id="47"/>
-    <w:bookmarkEnd w:id="48"/>
-    <w:bookmarkStart w:id="49" w:name="Xae8438daabda8cb94612e3c6673d334748fcf18"/>
-    <w:p>
-      <w:pPr>
-        <w:pStyle w:val="Heading2"/>
-      </w:pPr>
-      <w:r>
-        <w:t xml:space="preserve">4. Ma trận truy vết: use case ↔ chức năng</w:t>
+    <w:bookmarkStart w:id="48" w:name="X60aede1df8e0c1a1199d78aec46d7a9e5aad14d"/>
+    <w:p>
+      <w:pPr>
+        <w:pStyle w:val="Heading3"/>
+      </w:pPr>
+      <w:r>
+        <w:t xml:space="preserve">3.13 Các use case quản lý đơn giản</w:t>
       </w:r>
     </w:p>
     <w:tbl>
@@ -8760,6 +8637,461 @@
               <w:pStyle w:val="Compact"/>
             </w:pPr>
             <w:r>
+              <w:t xml:space="preserve">Mã</w:t>
+            </w:r>
+          </w:p>
+        </w:tc>
+        <w:tc>
+          <w:tcPr/>
+          <w:p>
+            <w:pPr>
+              <w:pStyle w:val="Compact"/>
+            </w:pPr>
+            <w:r>
+              <w:t xml:space="preserve">Mô tả ngắn</w:t>
+            </w:r>
+          </w:p>
+        </w:tc>
+      </w:tr>
+      <w:tr>
+        <w:tc>
+          <w:tcPr/>
+          <w:p>
+            <w:pPr>
+              <w:pStyle w:val="Compact"/>
+            </w:pPr>
+            <w:r>
+              <w:t xml:space="preserve">UC-03 Đăng xuất</w:t>
+            </w:r>
+          </w:p>
+        </w:tc>
+        <w:tc>
+          <w:tcPr/>
+          <w:p>
+            <w:pPr>
+              <w:pStyle w:val="Compact"/>
+            </w:pPr>
+            <w:r>
+              <w:t xml:space="preserve">Thu hồi refresh token, đóng WebSocket, xoá token ở trình duyệt, chuyển về trang đăng nhập.</w:t>
+            </w:r>
+          </w:p>
+        </w:tc>
+      </w:tr>
+      <w:tr>
+        <w:tc>
+          <w:tcPr/>
+          <w:p>
+            <w:pPr>
+              <w:pStyle w:val="Compact"/>
+            </w:pPr>
+            <w:r>
+              <w:t xml:space="preserve">UC-04 Nhận và xem thông báo</w:t>
+            </w:r>
+          </w:p>
+        </w:tc>
+        <w:tc>
+          <w:tcPr/>
+          <w:p>
+            <w:pPr>
+              <w:pStyle w:val="Compact"/>
+            </w:pPr>
+            <w:r>
+              <w:t xml:space="preserve">Thông báo lưu DB rồi đẩy qua WebSocket tới đúng người. Chuông hiện số chưa đọc, toast hiện ngay. Có trang danh sách, đánh dấu một hoặc tất cả là đã đọc. Kết nối lại thì lấy các thông báo bị lỡ. Một số loại thông báo gửi kèm email.</w:t>
+            </w:r>
+          </w:p>
+        </w:tc>
+      </w:tr>
+      <w:tr>
+        <w:tc>
+          <w:tcPr/>
+          <w:p>
+            <w:pPr>
+              <w:pStyle w:val="Compact"/>
+            </w:pPr>
+            <w:r>
+              <w:t xml:space="preserve">UC-05 Quản lý tài khoản giáo viên</w:t>
+            </w:r>
+          </w:p>
+        </w:tc>
+        <w:tc>
+          <w:tcPr/>
+          <w:p>
+            <w:pPr>
+              <w:pStyle w:val="Compact"/>
+            </w:pPr>
+            <w:r>
+              <w:t xml:space="preserve">Admin tạo giáo viên (tên đăng nhập, họ tên, email, mật khẩu tạm), sửa thông tin, khoá/mở, đặt lại mật khẩu. Giáo viên mới bị bắt đổi mật khẩu.</w:t>
+            </w:r>
+          </w:p>
+        </w:tc>
+      </w:tr>
+      <w:tr>
+        <w:tc>
+          <w:tcPr/>
+          <w:p>
+            <w:pPr>
+              <w:pStyle w:val="Compact"/>
+            </w:pPr>
+            <w:r>
+              <w:t xml:space="preserve">UC-06 Quản lý người dùng</w:t>
+            </w:r>
+          </w:p>
+        </w:tc>
+        <w:tc>
+          <w:tcPr/>
+          <w:p>
+            <w:pPr>
+              <w:pStyle w:val="Compact"/>
+            </w:pPr>
+            <w:r>
+              <w:t xml:space="preserve">Admin tìm theo tên, mã sinh viên, vai trò, trạng thái; xem chi tiết; khoá/mở tài khoản. Tài khoản bị khoá bị đăng xuất ngay.</w:t>
+            </w:r>
+          </w:p>
+        </w:tc>
+      </w:tr>
+      <w:tr>
+        <w:tc>
+          <w:tcPr/>
+          <w:p>
+            <w:pPr>
+              <w:pStyle w:val="Compact"/>
+            </w:pPr>
+            <w:r>
+              <w:t xml:space="preserve">UC-07 Xem nhật ký hệ thống</w:t>
+            </w:r>
+          </w:p>
+        </w:tc>
+        <w:tc>
+          <w:tcPr/>
+          <w:p>
+            <w:pPr>
+              <w:pStyle w:val="Compact"/>
+            </w:pPr>
+            <w:r>
+              <w:t xml:space="preserve">Lọc audit log theo người thực hiện, hành động, thời gian, IP.</w:t>
+            </w:r>
+          </w:p>
+        </w:tc>
+      </w:tr>
+      <w:tr>
+        <w:tc>
+          <w:tcPr/>
+          <w:p>
+            <w:pPr>
+              <w:pStyle w:val="Compact"/>
+            </w:pPr>
+            <w:r>
+              <w:t xml:space="preserve">UC-08 Quản lý phiên đăng nhập</w:t>
+            </w:r>
+          </w:p>
+        </w:tc>
+        <w:tc>
+          <w:tcPr/>
+          <w:p>
+            <w:pPr>
+              <w:pStyle w:val="Compact"/>
+            </w:pPr>
+            <w:r>
+              <w:t xml:space="preserve">Xem các phiên đang hoạt động (thiết bị, IP, thời gian) và buộc đăng xuất một phiên.</w:t>
+            </w:r>
+          </w:p>
+        </w:tc>
+      </w:tr>
+      <w:tr>
+        <w:tc>
+          <w:tcPr/>
+          <w:p>
+            <w:pPr>
+              <w:pStyle w:val="Compact"/>
+            </w:pPr>
+            <w:r>
+              <w:t xml:space="preserve">UC-09 Thống kê toàn hệ thống</w:t>
+            </w:r>
+          </w:p>
+        </w:tc>
+        <w:tc>
+          <w:tcPr/>
+          <w:p>
+            <w:pPr>
+              <w:pStyle w:val="Compact"/>
+            </w:pPr>
+            <w:r>
+              <w:t xml:space="preserve">Số người dùng theo vai trò, số lớp, số bài tập, số bài nộp theo ngày.</w:t>
+            </w:r>
+          </w:p>
+        </w:tc>
+      </w:tr>
+      <w:tr>
+        <w:tc>
+          <w:tcPr/>
+          <w:p>
+            <w:pPr>
+              <w:pStyle w:val="Compact"/>
+            </w:pPr>
+            <w:r>
+              <w:t xml:space="preserve">UC-10 Quản lý lớp học</w:t>
+            </w:r>
+          </w:p>
+        </w:tc>
+        <w:tc>
+          <w:tcPr/>
+          <w:p>
+            <w:pPr>
+              <w:pStyle w:val="Compact"/>
+            </w:pPr>
+            <w:r>
+              <w:t xml:space="preserve">Giáo viên tạo, sửa, xoá lớp (mã lớp duy nhất), xem thành viên, thêm sinh viên đã có tài khoản, xoá sinh viên khỏi lớp. Xoá lớp không xoá tài khoản sinh viên.</w:t>
+            </w:r>
+          </w:p>
+        </w:tc>
+      </w:tr>
+      <w:tr>
+        <w:tc>
+          <w:tcPr/>
+          <w:p>
+            <w:pPr>
+              <w:pStyle w:val="Compact"/>
+            </w:pPr>
+            <w:r>
+              <w:t xml:space="preserve">UC-15 Đóng, nhân bản bài</w:t>
+            </w:r>
+          </w:p>
+        </w:tc>
+        <w:tc>
+          <w:tcPr/>
+          <w:p>
+            <w:pPr>
+              <w:pStyle w:val="Compact"/>
+            </w:pPr>
+            <w:r>
+              <w:t xml:space="preserve">Đóng thì sinh viên không nộp được nữa nhưng vẫn xem được kết quả. Nhân bản tạo bản Nháp mới gồm đủ phần và rubric, chưa có người nhận.</w:t>
+            </w:r>
+          </w:p>
+        </w:tc>
+      </w:tr>
+      <w:tr>
+        <w:tc>
+          <w:tcPr/>
+          <w:p>
+            <w:pPr>
+              <w:pStyle w:val="Compact"/>
+            </w:pPr>
+            <w:r>
+              <w:t xml:space="preserve">UC-19 Thống kê và xuất bảng điểm</w:t>
+            </w:r>
+          </w:p>
+        </w:tc>
+        <w:tc>
+          <w:tcPr/>
+          <w:p>
+            <w:pPr>
+              <w:pStyle w:val="Compact"/>
+            </w:pPr>
+            <w:r>
+              <w:t xml:space="preserve">Thống kê một bài (điểm trung bình mỗi tiêu chí, phân bố band, tỉ lệ đúng hạn), theo sinh viên, theo lớp. Xuất</w:t>
+            </w:r>
+            <w:r>
+              <w:t xml:space="preserve"> </w:t>
+            </w:r>
+            <w:r>
+              <w:rPr>
+                <w:rStyle w:val="VerbatimChar"/>
+              </w:rPr>
+              <w:t xml:space="preserve">.xlsx</w:t>
+            </w:r>
+            <w:r>
+              <w:t xml:space="preserve"> </w:t>
+            </w:r>
+            <w:r>
+              <w:t xml:space="preserve">bảng điểm.</w:t>
+            </w:r>
+          </w:p>
+        </w:tc>
+      </w:tr>
+      <w:tr>
+        <w:tc>
+          <w:tcPr/>
+          <w:p>
+            <w:pPr>
+              <w:pStyle w:val="Compact"/>
+            </w:pPr>
+            <w:r>
+              <w:t xml:space="preserve">UC-20 Ngân hàng đề</w:t>
+            </w:r>
+          </w:p>
+        </w:tc>
+        <w:tc>
+          <w:tcPr/>
+          <w:p>
+            <w:pPr>
+              <w:pStyle w:val="Compact"/>
+            </w:pPr>
+            <w:r>
+              <w:t xml:space="preserve">Lưu một phần (đề + rubric) vào ngân hàng, gắn tag dạng đề, tìm và dùng lại khi soạn bài.</w:t>
+            </w:r>
+          </w:p>
+        </w:tc>
+      </w:tr>
+      <w:tr>
+        <w:tc>
+          <w:tcPr/>
+          <w:p>
+            <w:pPr>
+              <w:pStyle w:val="Compact"/>
+            </w:pPr>
+            <w:r>
+              <w:t xml:space="preserve">UC-21 Nhật ký chế độ thi</w:t>
+            </w:r>
+          </w:p>
+        </w:tc>
+        <w:tc>
+          <w:tcPr/>
+          <w:p>
+            <w:pPr>
+              <w:pStyle w:val="Compact"/>
+            </w:pPr>
+            <w:r>
+              <w:t xml:space="preserve">Giáo viên xem dòng thời gian sự kiện của từng sinh viên trong phiên thi.</w:t>
+            </w:r>
+          </w:p>
+        </w:tc>
+      </w:tr>
+      <w:tr>
+        <w:tc>
+          <w:tcPr/>
+          <w:p>
+            <w:pPr>
+              <w:pStyle w:val="Compact"/>
+            </w:pPr>
+            <w:r>
+              <w:t xml:space="preserve">UC-22 Xem bài được giao</w:t>
+            </w:r>
+          </w:p>
+        </w:tc>
+        <w:tc>
+          <w:tcPr/>
+          <w:p>
+            <w:pPr>
+              <w:pStyle w:val="Compact"/>
+            </w:pPr>
+            <w:r>
+              <w:t xml:space="preserve">Danh sách theo tab Cần làm / Sắp hết hạn (dưới 24 giờ) / Quá hạn / Đã nộp / Cần sửa. Mỗi bài có tiến độ từng phần và hạn nộp.</w:t>
+            </w:r>
+          </w:p>
+        </w:tc>
+      </w:tr>
+      <w:tr>
+        <w:tc>
+          <w:tcPr/>
+          <w:p>
+            <w:pPr>
+              <w:pStyle w:val="Compact"/>
+            </w:pPr>
+            <w:r>
+              <w:t xml:space="preserve">UC-25 Xem kết quả chấm</w:t>
+            </w:r>
+          </w:p>
+        </w:tc>
+        <w:tc>
+          <w:tcPr/>
+          <w:p>
+            <w:pPr>
+              <w:pStyle w:val="Compact"/>
+            </w:pPr>
+            <w:r>
+              <w:t xml:space="preserve">Chỉ khi đã trả bài: band từng phần và cả bài, điểm và nhận xét từng tiêu chí, checklist, nhận xét chung, nhận xét inline tô màu trên bài.</w:t>
+            </w:r>
+          </w:p>
+        </w:tc>
+      </w:tr>
+      <w:tr>
+        <w:tc>
+          <w:tcPr/>
+          <w:p>
+            <w:pPr>
+              <w:pStyle w:val="Compact"/>
+            </w:pPr>
+            <w:r>
+              <w:t xml:space="preserve">UC-28 Kết quả học tập</w:t>
+            </w:r>
+          </w:p>
+        </w:tc>
+        <w:tc>
+          <w:tcPr/>
+          <w:p>
+            <w:pPr>
+              <w:pStyle w:val="Compact"/>
+            </w:pPr>
+            <w:r>
+              <w:t xml:space="preserve">Biểu đồ band theo thời gian, điểm trung bình theo tiêu chí, số bài nộp muộn.</w:t>
+            </w:r>
+          </w:p>
+        </w:tc>
+      </w:tr>
+      <w:tr>
+        <w:tc>
+          <w:tcPr/>
+          <w:p>
+            <w:pPr>
+              <w:pStyle w:val="Compact"/>
+            </w:pPr>
+            <w:r>
+              <w:t xml:space="preserve">UC-32 Kiểm tra đạo văn</w:t>
+            </w:r>
+          </w:p>
+        </w:tc>
+        <w:tc>
+          <w:tcPr/>
+          <w:p>
+            <w:pPr>
+              <w:pStyle w:val="Compact"/>
+            </w:pPr>
+            <w:r>
+              <w:t xml:space="preserve">Sau mỗi lần nộp, chạy nền: so độ giống nhau với các bài cùng phần; vượt ngưỡng thì gắn cờ cho giáo viên.</w:t>
+            </w:r>
+          </w:p>
+        </w:tc>
+      </w:tr>
+    </w:tbl>
+    <w:p>
+      <w:r>
+        <w:pict>
+          <v:rect style="width:0;height:1.5pt" o:hralign="center" o:hrstd="t" o:hr="t"/>
+        </w:pict>
+      </w:r>
+    </w:p>
+    <w:bookmarkEnd w:id="48"/>
+    <w:bookmarkEnd w:id="49"/>
+    <w:bookmarkStart w:id="50" w:name="Xae8438daabda8cb94612e3c6673d334748fcf18"/>
+    <w:p>
+      <w:pPr>
+        <w:pStyle w:val="Heading2"/>
+      </w:pPr>
+      <w:r>
+        <w:t xml:space="preserve">4. Ma trận truy vết: use case ↔ chức năng</w:t>
+      </w:r>
+    </w:p>
+    <w:tbl>
+      <w:tblPr>
+        <w:tblStyle w:val="Table"/>
+        <w:tblW w:type="auto" w:w="0"/>
+        <w:tblLook w:firstRow="1" w:lastRow="0" w:firstColumn="0" w:lastColumn="0" w:noHBand="0" w:noVBand="0" w:val="0020"/>
+      </w:tblPr>
+      <w:tblGrid>
+        <w:gridCol w:w="3960"/>
+        <w:gridCol w:w="3960"/>
+      </w:tblGrid>
+      <w:tr>
+        <w:trPr>
+          <w:tblHeader w:val="on"/>
+        </w:trPr>
+        <w:tc>
+          <w:tcPr/>
+          <w:p>
+            <w:pPr>
+              <w:pStyle w:val="Compact"/>
+            </w:pPr>
+            <w:r>
               <w:t xml:space="preserve">Nhóm chức năng</w:t>
             </w:r>
           </w:p>
@@ -8945,8 +9277,8 @@
         </w:tc>
       </w:tr>
     </w:tbl>
-    <w:bookmarkEnd w:id="49"/>
     <w:bookmarkEnd w:id="50"/>
+    <w:bookmarkEnd w:id="51"/>
     <w:sectPr>
       <w:footnotePr>
         <w:numRestart w:val="eachSect"/>
@@ -9609,73 +9941,73 @@
     <w:abstractNumId w:val="991"/>
   </w:num>
   <w:num w:numId="1031">
-    <w:abstractNumId w:val="991"/>
+    <w:abstractNumId w:val="99411"/>
+    <w:lvlOverride w:ilvl="0">
+      <w:startOverride w:val="1"/>
+    </w:lvlOverride>
+    <w:lvlOverride w:ilvl="1">
+      <w:startOverride w:val="1"/>
+    </w:lvlOverride>
+    <w:lvlOverride w:ilvl="2">
+      <w:startOverride w:val="1"/>
+    </w:lvlOverride>
+    <w:lvlOverride w:ilvl="3">
+      <w:startOverride w:val="1"/>
+    </w:lvlOverride>
+    <w:lvlOverride w:ilvl="4">
+      <w:startOverride w:val="1"/>
+    </w:lvlOverride>
+    <w:lvlOverride w:ilvl="5">
+      <w:startOverride w:val="1"/>
+    </w:lvlOverride>
+    <w:lvlOverride w:ilvl="6">
+      <w:startOverride w:val="1"/>
+    </w:lvlOverride>
+    <w:lvlOverride w:ilvl="7">
+      <w:startOverride w:val="1"/>
+    </w:lvlOverride>
+    <w:lvlOverride w:ilvl="8">
+      <w:startOverride w:val="1"/>
+    </w:lvlOverride>
   </w:num>
   <w:num w:numId="1032">
-    <w:abstractNumId w:val="99411"/>
-    <w:lvlOverride w:ilvl="0">
-      <w:startOverride w:val="1"/>
-    </w:lvlOverride>
-    <w:lvlOverride w:ilvl="1">
-      <w:startOverride w:val="1"/>
-    </w:lvlOverride>
-    <w:lvlOverride w:ilvl="2">
-      <w:startOverride w:val="1"/>
-    </w:lvlOverride>
-    <w:lvlOverride w:ilvl="3">
-      <w:startOverride w:val="1"/>
-    </w:lvlOverride>
-    <w:lvlOverride w:ilvl="4">
-      <w:startOverride w:val="1"/>
-    </w:lvlOverride>
-    <w:lvlOverride w:ilvl="5">
-      <w:startOverride w:val="1"/>
-    </w:lvlOverride>
-    <w:lvlOverride w:ilvl="6">
-      <w:startOverride w:val="1"/>
-    </w:lvlOverride>
-    <w:lvlOverride w:ilvl="7">
-      <w:startOverride w:val="1"/>
-    </w:lvlOverride>
-    <w:lvlOverride w:ilvl="8">
-      <w:startOverride w:val="1"/>
-    </w:lvlOverride>
+    <w:abstractNumId w:val="991"/>
   </w:num>
   <w:num w:numId="1033">
     <w:abstractNumId w:val="991"/>
   </w:num>
   <w:num w:numId="1034">
-    <w:abstractNumId w:val="991"/>
+    <w:abstractNumId w:val="99411"/>
+    <w:lvlOverride w:ilvl="0">
+      <w:startOverride w:val="1"/>
+    </w:lvlOverride>
+    <w:lvlOverride w:ilvl="1">
+      <w:startOverride w:val="1"/>
+    </w:lvlOverride>
+    <w:lvlOverride w:ilvl="2">
+      <w:startOverride w:val="1"/>
+    </w:lvlOverride>
+    <w:lvlOverride w:ilvl="3">
+      <w:startOverride w:val="1"/>
+    </w:lvlOverride>
+    <w:lvlOverride w:ilvl="4">
+      <w:startOverride w:val="1"/>
+    </w:lvlOverride>
+    <w:lvlOverride w:ilvl="5">
+      <w:startOverride w:val="1"/>
+    </w:lvlOverride>
+    <w:lvlOverride w:ilvl="6">
+      <w:startOverride w:val="1"/>
+    </w:lvlOverride>
+    <w:lvlOverride w:ilvl="7">
+      <w:startOverride w:val="1"/>
+    </w:lvlOverride>
+    <w:lvlOverride w:ilvl="8">
+      <w:startOverride w:val="1"/>
+    </w:lvlOverride>
   </w:num>
   <w:num w:numId="1035">
-    <w:abstractNumId w:val="99411"/>
-    <w:lvlOverride w:ilvl="0">
-      <w:startOverride w:val="1"/>
-    </w:lvlOverride>
-    <w:lvlOverride w:ilvl="1">
-      <w:startOverride w:val="1"/>
-    </w:lvlOverride>
-    <w:lvlOverride w:ilvl="2">
-      <w:startOverride w:val="1"/>
-    </w:lvlOverride>
-    <w:lvlOverride w:ilvl="3">
-      <w:startOverride w:val="1"/>
-    </w:lvlOverride>
-    <w:lvlOverride w:ilvl="4">
-      <w:startOverride w:val="1"/>
-    </w:lvlOverride>
-    <w:lvlOverride w:ilvl="5">
-      <w:startOverride w:val="1"/>
-    </w:lvlOverride>
-    <w:lvlOverride w:ilvl="6">
-      <w:startOverride w:val="1"/>
-    </w:lvlOverride>
-    <w:lvlOverride w:ilvl="7">
-      <w:startOverride w:val="1"/>
-    </w:lvlOverride>
-    <w:lvlOverride w:ilvl="8">
-      <w:startOverride w:val="1"/>
-    </w:lvlOverride>
+    <w:abstractNumId w:val="991"/>
   </w:num>
   <w:num w:numId="1036">
     <w:abstractNumId w:val="991"/>
@@ -9777,6 +10109,39 @@
     </w:lvlOverride>
   </w:num>
   <w:num w:numId="1042">
+    <w:abstractNumId w:val="991"/>
+  </w:num>
+  <w:num w:numId="1043">
+    <w:abstractNumId w:val="99411"/>
+    <w:lvlOverride w:ilvl="0">
+      <w:startOverride w:val="1"/>
+    </w:lvlOverride>
+    <w:lvlOverride w:ilvl="1">
+      <w:startOverride w:val="1"/>
+    </w:lvlOverride>
+    <w:lvlOverride w:ilvl="2">
+      <w:startOverride w:val="1"/>
+    </w:lvlOverride>
+    <w:lvlOverride w:ilvl="3">
+      <w:startOverride w:val="1"/>
+    </w:lvlOverride>
+    <w:lvlOverride w:ilvl="4">
+      <w:startOverride w:val="1"/>
+    </w:lvlOverride>
+    <w:lvlOverride w:ilvl="5">
+      <w:startOverride w:val="1"/>
+    </w:lvlOverride>
+    <w:lvlOverride w:ilvl="6">
+      <w:startOverride w:val="1"/>
+    </w:lvlOverride>
+    <w:lvlOverride w:ilvl="7">
+      <w:startOverride w:val="1"/>
+    </w:lvlOverride>
+    <w:lvlOverride w:ilvl="8">
+      <w:startOverride w:val="1"/>
+    </w:lvlOverride>
+  </w:num>
+  <w:num w:numId="1044">
     <w:abstractNumId w:val="991"/>
   </w:num>
 </w:numbering>

</xml_diff>

<commit_message>
chuot lai giao dien
</commit_message>
<xml_diff>
--- a/docx/02-use-case.docx
+++ b/docx/02-use-case.docx
@@ -9000,6 +9000,19 @@
             </w:pPr>
             <w:r>
               <w:t xml:space="preserve">Admin tạo giáo viên (tên đăng nhập, họ tên, email, mật khẩu tạm), sửa thông tin, khoá/mở, đặt lại mật khẩu. Giáo viên mới bị bắt đổi mật khẩu.</w:t>
+            </w:r>
+            <w:r>
+              <w:t xml:space="preserve"> </w:t>
+            </w:r>
+            <w:r>
+              <w:rPr>
+                <w:b/>
+                <w:bCs/>
+              </w:rPr>
+              <w:t xml:space="preserve">UC-05b</w:t>
+            </w:r>
+            <w:r>
+              <w:t xml:space="preserve">: import nhiều giáo viên từ file .xlsx / .csv — mỗi dòng xử lý riêng, giáo viên đã có bị bỏ qua, mật khẩu tạm của tài khoản mới hiện một lần để tải về.</w:t>
             </w:r>
           </w:p>
         </w:tc>

</xml_diff>